<commit_message>
Make talk colloquial, richer content; add figures to deck
- Rewrite Word script in plain spoken Chinese with analogies (door/scale)
  so non-experts follow; richer detail; ~10-12 min, per-speaker cues kept
- Deck: add hands-only-vs-footed stick-figure comparison (slide 2),
  icon circles on idea cards (slide 3), balance-meter colour strip
  (slide 6), title accent; polish throughout
- Regenerate SummitVR_Pre.pptx (15 slides, 6 videos) + 演讲稿.docx

Co-Authored-By: Claude Opus 4.8 (1M context) <noreply@anthropic.com>
</commit_message>
<xml_diff>
--- a/docs/SummitVR_演讲稿.docx
+++ b/docs/SummitVR_演讲稿.docx
@@ -31,7 +31,7 @@
           <w:color w:val="6B7280"/>
           <w:sz w:val="24"/>
         </w:rPr>
-        <w:t>课程 AI3618 · 上海交通大学 · 10 分钟 · 五人分工汇报</w:t>
+        <w:t>课程 AI3618 · 上海交通大学 · 约 10–12 分钟 · 五人分工汇报</w:t>
       </w:r>
     </w:p>
     <w:p>
@@ -682,7 +682,7 @@
           <w:color w:val="6B7280"/>
           <w:sz w:val="20"/>
         </w:rPr>
-        <w:t>站定，等封面页投出再开口。语速放慢，这是全场第一印象。</w:t>
+        <w:t>站定，等封面页投出再开口。语速放慢，笑一下，这是全场第一印象。</w:t>
       </w:r>
     </w:p>
     <w:p>
@@ -696,7 +696,7 @@
           <w:color w:val="1C1F26"/>
           <w:sz w:val="23"/>
         </w:rPr>
-        <w:t>各位老师、同学好。我们这组的项目叫 Summit VR——一个 VR 攀岩游戏。</w:t>
+        <w:t>各位老师、同学好。先问大家一个问题：你们玩过 VR 攀岩吗？戴上头显，伸手抓住岩壁上的点，往上一拉，整个人就「爬」上去了——是不是还挺爽的？</w:t>
       </w:r>
     </w:p>
     <w:p>
@@ -710,7 +710,7 @@
           <w:color w:val="1C1F26"/>
           <w:sz w:val="23"/>
         </w:rPr>
-        <w:t>先说一个现象：VR 攀岩其实很成功，像 The Climb、Gorilla Tag 都很火，因为它舒适、不晕。但它们有一个共同的问题——几乎全是「纯手」：你只是用两只手抓、然后把自己拉上去，掉下来的原因也只有两个，要么松手，要么够不到。</w:t>
+        <w:t>我们这组的项目也是 VR 攀岩，叫 Summit VR。但在做之前，我们发现现在市面上的 VR 攀岩游戏——像很火的 The Climb、Gorilla Tag——其实都有同一个毛病：它们全靠两只手。你就是不停地抓、不停地拉，掉下来也只有两种可能：要么手松了，要么手不够长够不着。</w:t>
       </w:r>
     </w:p>
     <w:p>
@@ -724,7 +724,7 @@
           <w:color w:val="1C1F26"/>
           <w:sz w:val="23"/>
         </w:rPr>
-        <w:t>可真实的抱石恰恰相反。真正的难点往往不在手有多大力，而在你的重心怎么落在脚上、要不要换脚、身体会不会像门一样「开门」被甩出去。也就是说，真实攀岩最核心的身体平衡和脚法，被现有的 VR 攀岩全砍掉了。</w:t>
+        <w:t>可是你去问任何一个真正爬过岩的人，他都会告诉你：攀岩真正难的地方，根本不是手劲大不大，而是脚怎么踩、重心怎么放。打个比方，你贴在墙上，两只手都抓在右边，身体就会像一扇门一样「啪」地往外甩开——攀岩里这叫「开门」。怎么破？踩一只左脚顶住，人就稳了。这种「用脚和重心保持平衡」的功夫，才是攀岩的精髓。</w:t>
       </w:r>
     </w:p>
     <w:p>
@@ -738,7 +738,7 @@
           <w:color w:val="1C1F26"/>
           <w:sz w:val="23"/>
         </w:rPr>
-        <w:t>这就是我们要补的缺口：在只有头和两个手柄的普通 VR 设备上，把「平衡」和「脚法」这两层做回来，变成真正影响输赢的可玩机制。</w:t>
+        <w:t>而现在的 VR 攀岩，恰恰把这最精髓的一层——脚和平衡——全给砍掉了。这就是我们想补回来的东西：在一台普普通通、只有头显加两个手柄的 VR 设备上，把「平衡」和「脚法」做成真正会影响你输赢的玩法。</w:t>
       </w:r>
     </w:p>
     <w:p>
@@ -752,7 +752,7 @@
           <w:color w:val="1C1F26"/>
           <w:sz w:val="23"/>
         </w:rPr>
-        <w:t>接下来由负责攀爬系统的薛俊智，讲我们具体是怎么想、怎么实现这套核心机制的。</w:t>
+        <w:t>接下来，请负责攀爬核心的薛俊智，给大家讲讲我们到底是怎么把这件事做出来的。</w:t>
       </w:r>
     </w:p>
     <w:p>
@@ -775,7 +775,7 @@
           <w:color w:val="6B7280"/>
           <w:sz w:val="20"/>
         </w:rPr>
-        <w:t>说完转头示意 P1 接。目录页可一带而过，或在「这就是我们要补的缺口」后顺势点一句六个部分。</w:t>
+        <w:t>说完转头示意 P1。目录页可一带而过，或在结尾顺势点一句「整个汇报分六块」。</w:t>
       </w:r>
     </w:p>
     <w:p>
@@ -867,7 +867,7 @@
           <w:color w:val="6B7280"/>
           <w:sz w:val="20"/>
         </w:rPr>
-        <w:t>这是技术核心，最可能被追问。平衡机制那页放慢，讲清「踩脚为什么管用」。</w:t>
+        <w:t>这是技术核心，最可能被追问。平衡机制那页务必放慢，用「门」「秤」的比喻把它讲透。</w:t>
       </w:r>
     </w:p>
     <w:p>
@@ -881,7 +881,7 @@
           <w:color w:val="1C1F26"/>
           <w:sz w:val="23"/>
         </w:rPr>
-        <w:t>谢谢。我先讲我们的核心思路，一句话概括就是：测不到的就抽象，只模拟影响玩法的部分。</w:t>
+        <w:t>谢谢艺豪。我先讲我们整个的思路，其实就一句大白话：测不到的，就别硬测，把它「估」出来；只去做真正影响玩法的那部分。</w:t>
       </w:r>
     </w:p>
     <w:p>
@@ -895,7 +895,7 @@
           <w:color w:val="1C1F26"/>
           <w:sz w:val="23"/>
         </w:rPr>
-        <w:t>具体三点。第一，头当重心：普通 VR 只能追踪头和两只手柄，追踪不到脚，所以我们用头显的位置当重心的代理，看头有没有歪出支撑范围。第二，脚做成抽象状态：不去渲染那种会穿模的假腿，而是让虚拟脚自动吸附到身体下方的脚点，作用是撑宽支撑面。第三，平衡是一个渐变的条，带缓冲时间，不是一下子摔——可以预警、可以救回来。</w:t>
+        <w:t>为什么这么说？因为普通 VR 设备只能知道你的头和两只手在哪，它根本看不到你的脚。那脚怎么办？我们想了三招。第一招，拿头当「重心」。你想，人贴在墙上的时候，脑袋基本是跟着身体一起晃的，头往哪边歪，重心就往哪边跑，所以盯着头的左右位置，就能大概知道你有没有失去平衡。</w:t>
       </w:r>
     </w:p>
     <w:p>
@@ -909,7 +909,7 @@
           <w:color w:val="1C1F26"/>
           <w:sz w:val="23"/>
         </w:rPr>
-        <w:t>这套设计不是拍脑袋。有两篇文献支撑我们：一篇 CHI 2020 的研究发现，在 VR 攀岩里「脚」比「手」更影响真实感；另一篇 2026 年的研究验证了用头当重心来判断跌倒是可行的。我们就把这两个结论落到了消费级硬件上。</w:t>
+        <w:t>第二招，脚不画出来，只算它的「作用」。我们不去做一双逼真的虚拟腿——那种腿在攀岩这种高抬腿、侧身的姿势下特别容易穿模、特别假。我们只让一只「看不见的脚」自动踩到你身体下方最近的脚点上，它唯一的作用就是帮你「把站得更稳」。第三招，失衡不是「啪」一下摔死，而是有一根会慢慢掉的平衡条，给你反应时间，让你能救回来。</w:t>
       </w:r>
     </w:p>
     <w:p>
@@ -923,7 +923,7 @@
           <w:color w:val="1C1F26"/>
           <w:sz w:val="23"/>
         </w:rPr>
-        <w:t>架构上，最关键的一点是「加法式设计」：反向位移的手抓攀爬是成熟的基座，平衡和脚法是叠在上面的可选层，把它们关掉，游戏就退回成普通的纯手攀岩，所以新机制永远不会把稳的部分搞坏。</w:t>
+        <w:t>这套设计也不是我们拍脑袋想的。有两篇论文给我们撑腰：一篇 2020 年的研究专门做实验发现，在 VR 攀岩里「让你看到脚」比「让你看到手」更能带来真实感；另一篇 2026 年的研究，就是用「头当重心」来判断人会不会摔，而且做了真人实验验证过。我们等于是把这两个结论，搬到了人人都买得起的硬件上。</w:t>
       </w:r>
     </w:p>
     <w:p>
@@ -937,7 +937,7 @@
           <w:color w:val="1C1F26"/>
           <w:sz w:val="23"/>
         </w:rPr>
-        <w:t>那平衡到底怎么算？我们把支撑面压成一维的左右区间：把所有接触点——抓住的手点加上踩住的脚点——投影到墙的横轴上，得到一个区间。头的横向位置落在区间里就是稳，歪出去超过缓冲时间，平衡条就开始掉，掉空就脱落坠落。</w:t>
+        <w:t>讲讲怎么搭的。这里有个很重要的设计叫「加法」：手抓、往上拉这套基本操作是成熟的、稳的，我们的平衡和脚法是「加」在它上面的两层。你把这两层关掉，游戏立马变回一个普通的纯手攀岩，照样能玩。所以我们加新东西，永远不会把原来能跑的部分搞坏——这点对做项目很关键。</w:t>
       </w:r>
     </w:p>
     <w:p>
@@ -951,7 +951,7 @@
           <w:color w:val="1C1F26"/>
           <w:sz w:val="23"/>
         </w:rPr>
-        <w:t>这里就能解释，为什么踩一只脚能救回来：因为踩脚给区间增加了一个新的接触点，把区间撑宽了，你的重心就重新被框回到里面。这一下，就是整个 demo 的高光。</w:t>
+        <w:t>那平衡到底怎么算的？说穿了特别简单，就像一杆秤。我把你所有的「支撑点」——抓住的手、踩住的脚——在墙的左右方向上拉出一条线段，这就是你的「安全区间」。然后看你的头（也就是重心）落在哪：落在区间里，稳；歪出区间了，平衡条就开始往下掉，掉光了你就脱手摔下去。</w:t>
       </w:r>
     </w:p>
     <w:p>
@@ -965,7 +965,21 @@
           <w:color w:val="1C1F26"/>
           <w:sz w:val="23"/>
         </w:rPr>
-        <w:t>脚法和线路具体怎么设计，交给吴一轩。</w:t>
+        <w:t>现在就能回答那个核心问题了：为什么踩一只脚就能救回来？因为你多踩一个点，那条「安全区间」就被撑宽了，你原来歪在外面的重心，一下就重新被框进了安全区里。演示里失衡变红、踩脚回正的那一瞬间，就是我们整个项目最得意的一下。</w:t>
+      </w:r>
+    </w:p>
+    <w:p>
+      <w:pPr>
+        <w:spacing w:after="160" w:line="348" w:lineRule="auto"/>
+        <w:ind w:left="173"/>
+      </w:pPr>
+      <w:r>
+        <w:rPr>
+          <w:rFonts w:ascii="Microsoft YaHei" w:hAnsi="Microsoft YaHei" w:eastAsia="Microsoft YaHei"/>
+          <w:color w:val="1C1F26"/>
+          <w:sz w:val="23"/>
+        </w:rPr>
+        <w:t>脚和线路具体怎么设计的，请吴一轩接着讲。</w:t>
       </w:r>
     </w:p>
     <w:p>
@@ -988,7 +1002,7 @@
           <w:color w:val="6B7280"/>
           <w:sz w:val="20"/>
         </w:rPr>
-        <w:t>「这一下就是整个 demo 的高光」说完停半拍，再过渡。</w:t>
+        <w:t>「最得意的一下」说完停半拍，再过渡。这句是全场记忆点。</w:t>
       </w:r>
     </w:p>
     <w:p>
@@ -1080,7 +1094,7 @@
           <w:color w:val="6B7280"/>
           <w:sz w:val="20"/>
         </w:rPr>
-        <w:t>线路页有视频缩略图，可以指着讲。强调「颜色只是建议」和 The Gap 的意义。</w:t>
+        <w:t>线路页有视频缩略图，指着讲。重点把「颜色只是建议」和 The Gap 的梗讲出来，可以轻松点。</w:t>
       </w:r>
     </w:p>
     <w:p>
@@ -1094,7 +1108,7 @@
           <w:color w:val="1C1F26"/>
           <w:sz w:val="23"/>
         </w:rPr>
-        <w:t>谢谢。我接着讲脚和线路。前面说脚是抽象状态，具体来说：我们从头往下估一个落脚区，左右各找最近的脚点吸住；爬过去之后这只脚才脱离、再吸下一个，我们叫它 foot-gluing，就像真实攀岩里你踩稳一只脚才会去动它。</w:t>
+        <w:t>谢谢俊智。我接着把脚和线路讲细一点。刚才说脚是「看不见」的，那它怎么知道该踩哪？其实很像真人爬岩：你踩稳一只脚，是不会随便挪的，非得等爬高了、这只脚实在别扭了，才会换到下一个点。我们就照这个来——脚一旦踩上某个点，就「黏」在那儿，直到你爬过去够不着了，它才松开去找下一个。这样平衡才稳，不会一直跳来跳去。</w:t>
       </w:r>
     </w:p>
     <w:p>
@@ -1108,7 +1122,7 @@
           <w:color w:val="1C1F26"/>
           <w:sz w:val="23"/>
         </w:rPr>
-        <w:t>有人会问，为什么不用 IK 或者生成式的腿？因为在贴墙、高抬腿、侧身这些攀岩姿势下，那些算法会崩、会穿模，而且跟机制无关——我们要的只是「脚在哪、撑不撑得住」这个信息，抽象状态就够了。所有平衡参数都是经验初值、可以在编辑器里随时调。</w:t>
+        <w:t>可能有人会问，干嘛不老老实实做一双会动的腿？因为在攀岩这种高抬腿、侧身的姿势下，自动算出来的腿十有八九是歪的、穿模的，特别别扭。而我们根本不关心腿长啥样，只关心「这只脚撑不撑得住」——做双假腿纯属费力不讨好。</w:t>
       </w:r>
     </w:p>
     <w:p>
@@ -1122,7 +1136,7 @@
           <w:color w:val="1C1F26"/>
           <w:sz w:val="23"/>
         </w:rPr>
-        <w:t>再说一个真约束：手是有最大臂展的，大约 0.88 米，够不到的握点就是抓不住，你必须先把身体移过去。这正是攀岩的难点来源。</w:t>
+        <w:t>还有个细节挺有意思：手是有长度的，大概就一臂展，0.88 米左右。够不着的点你就是抓不到，硬伸也没用，得先把身体挪过去。这一下子就有攀岩那味儿了——不是无脑乱抓，是要规划路线的。</w:t>
       </w:r>
     </w:p>
     <w:p>
@@ -1136,7 +1150,7 @@
           <w:color w:val="1C1F26"/>
           <w:sz w:val="23"/>
         </w:rPr>
-        <w:t>线路方面，我们用程序化生成，不依赖美术也能跑，一共做了 5 条。其中 4 条可以完攀，难度递增：入门的 Warm-up、逼你用脚维持平衡的 Balance Test、用易碎点逼你别久留的 The Arête、考验体力管理的 Endurance。</w:t>
+        <w:t>线路我们做了 5 条，全是程序自动生成的，不用美术也能跑。其中 4 条能爬到顶，难度一条比一条高：热身的 Warm-up；专门逼你用脚保平衡的 Balance Test；放了「易碎点」、逼你别磨蹭的 The Arête；还有考验体力、得省着劲爬的 Endurance。</w:t>
       </w:r>
     </w:p>
     <w:p>
@@ -1150,7 +1164,7 @@
           <w:color w:val="1C1F26"/>
           <w:sz w:val="23"/>
         </w:rPr>
-        <w:t>还有一个细节：握点颜色现在只是「建议用途」，不再是硬限制——和真实岩壁一样，手脚都能用任意点。但默认线路是故意设计成不能纯手通过的：两只手都在右边时重心会出界，你必须踩左脚或者用 flag 才能过去。</w:t>
+        <w:t>这里要澄清一个点：岩点的颜色——黄的、橙的、紫的——现在只是「建议」，不是硬规定。跟真岩壁一样，你手脚想踩哪个都行。但我们故意把默认线路设计成「纯用手过不去」：你两只手都搬到右边的时候，重心一定会甩出去，这时候你非踩个左脚不可。逼你用脚，懂了吧。</w:t>
       </w:r>
     </w:p>
     <w:p>
@@ -1164,7 +1178,7 @@
           <w:color w:val="1C1F26"/>
           <w:sz w:val="23"/>
         </w:rPr>
-        <w:t>最后第 5 条线路 The Gap，是故意做成不可完攀的：中间留了 2 米空白，怎么伸都够不到，它存在的意义就是证明「够不够得着」是个真机制。下面请邹沛霖带大家看 demo。</w:t>
+        <w:t>最后第 5 条线路最皮，叫 The Gap，是我们故意做成「爬不上去」的——中间空了 2 米，你怎么伸都够不着。它存在的唯一意义，就是向大家证明：我们这个「手够不够得着」是真的有用的，不是摆设。好，下面请邹沛霖带大家看实际效果。</w:t>
       </w:r>
     </w:p>
     <w:p>
@@ -1187,7 +1201,7 @@
           <w:color w:val="6B7280"/>
           <w:sz w:val="20"/>
         </w:rPr>
-        <w:t>说到「看 demo」时把场子交给 P3，由他控制视频播放。</w:t>
+        <w:t>说到「看实际效果」把场子交给 P3，由他控制视频播放。</w:t>
       </w:r>
     </w:p>
     <w:p>
@@ -1279,7 +1293,7 @@
           <w:color w:val="6B7280"/>
           <w:sz w:val="20"/>
         </w:rPr>
-        <w:t>先点开第 8 页的 demo 视频，边播边讲。视频约 25 秒，旁白要卡着画面。</w:t>
+        <w:t>先点开第 8 页 demo 视频，边播边讲，旁白卡着画面。视频约 25 秒，别抢拍。</w:t>
       </w:r>
     </w:p>
     <w:p>
@@ -1293,7 +1307,7 @@
           <w:color w:val="1C1F26"/>
           <w:sz w:val="23"/>
         </w:rPr>
-        <w:t>好，我们直接看这段演示。大家注意平衡条——现在这个人两只手都伸到了右边，平衡条开始变红、闪烁，这就是重心已经歪出支撑范围了。</w:t>
+        <w:t>好，咱们直接看。大家盯着屏幕上这根平衡条——看，现在这个小人两只手都伸到右边去了，平衡条开始变红、闪起来了，这就是在告诉你：重心歪出去了，要掉了！</w:t>
       </w:r>
     </w:p>
     <w:p>
@@ -1307,7 +1321,7 @@
           <w:color w:val="1C1F26"/>
           <w:sz w:val="23"/>
         </w:rPr>
-        <w:t>看这里——他踩上了左边这个橙色的脚点，平衡条立刻回来了，人稳住了。这一下「失衡变红、踩脚回正」，就是市面上所有 VR 攀岩都没有的东西。</w:t>
+        <w:t>注意看这一下——他踩上了左边这个橙色的脚点，平衡条「唰」地就回来了，人稳住了。就这一下，「变红、踩脚、回正」，是现在市面上所有 VR 攀岩都做不到的。这就是我们的招牌动作。</w:t>
       </w:r>
     </w:p>
     <w:p>
@@ -1321,7 +1335,7 @@
           <w:color w:val="1C1F26"/>
           <w:sz w:val="23"/>
         </w:rPr>
-        <w:t>旁边是颜色图例：黄手、橙脚、紫任意、绿登顶。脱落之后会重生回检查点，登顶时顶部会显示 Summit 加上完成时间。</w:t>
+        <w:t>旁边这几个颜色是图例：黄的是手点、橙的是脚点、绿的是终点。要是真掉下去了，会重生回到检查点，爬到顶的时候，上面会蹦出「Summit」和你的通关时间。</w:t>
       </w:r>
     </w:p>
     <w:p>
@@ -1344,7 +1358,7 @@
           <w:color w:val="6B7280"/>
           <w:sz w:val="20"/>
         </w:rPr>
-        <w:t>切到第 9 页线路视频，快速扫一遍四条完攀 + The Gap，再切第 11 页化身演进图。</w:t>
+        <w:t>切第 9 页线路视频，快速扫四条完攀 + The Gap，再切第 11 页化身演进对比图。</w:t>
       </w:r>
     </w:p>
     <w:p>
@@ -1358,7 +1372,7 @@
           <w:color w:val="1C1F26"/>
           <w:sz w:val="23"/>
         </w:rPr>
-        <w:t>画面上这几段是四条线路的完整完攀，最后这条 The Gap 就是刚才说的够不到的那条。</w:t>
+        <w:t>这几段是四条线路从头爬到顶的完整录像，最后这条够不着的，就是刚才一轩说的 The Gap。</w:t>
       </w:r>
     </w:p>
     <w:p>
@@ -1372,7 +1386,7 @@
           <w:color w:val="1C1F26"/>
           <w:sz w:val="23"/>
         </w:rPr>
-        <w:t>关于画面，我们也做了打磨。一开始的小人是直挺挺的假人，我们对标一款物理攀岩游戏，一轮轮逐帧比对，把它改成了身体挂在手上、单手悬挂时整个躯干会倒向那只手、头始终朝着岩壁的样子，看起来就像真人在爬。这些只在演示里，不影响游戏逻辑。</w:t>
+        <w:t>再说说画面。我们的小人一开始特别丑，是个直挺挺的假人，跟提线木偶似的。后来我们找了一款做得很好的物理攀岩游戏当参照，一帧一帧对着改，改成了现在这样——整个身子是「挂」在抓着的那只手上的，单手吊着时身体会自然倒向那只手，脑袋还一直冲着岩壁看，一下就像真人在爬了。这些纯为好看，不影响里面的玩法逻辑。</w:t>
       </w:r>
     </w:p>
     <w:p>
@@ -1386,7 +1400,7 @@
           <w:color w:val="1C1F26"/>
           <w:sz w:val="23"/>
         </w:rPr>
-        <w:t>接下来请陶锐讲我们整体的开发思路和项目交付情况。</w:t>
+        <w:t>接下来请陶锐，给大家讲讲我们整个项目是怎么一步步做出来的，最后交付了些什么。</w:t>
       </w:r>
     </w:p>
     <w:p>
@@ -1478,7 +1492,7 @@
           <w:color w:val="6B7280"/>
           <w:sz w:val="20"/>
         </w:rPr>
-        <w:t>这是收尾，要稳。结尾「谢谢」之后停住，准备接 Q&amp;A。</w:t>
+        <w:t>这是收尾，语气要稳、要收得住。结尾「谢谢」后停住，准备接 Q&amp;A。</w:t>
       </w:r>
     </w:p>
     <w:p>
@@ -1492,7 +1506,7 @@
           <w:color w:val="1C1F26"/>
           <w:sz w:val="23"/>
         </w:rPr>
-        <w:t>谢谢。我讲一下我们整体是怎么推进这个项目的，以及最后交付了什么。</w:t>
+        <w:t>谢谢沛霖。我来说说我们这个项目整体是怎么推进的，以及最后到底做出了什么。</w:t>
       </w:r>
     </w:p>
     <w:p>
@@ -1506,7 +1520,7 @@
           <w:color w:val="1C1F26"/>
           <w:sz w:val="23"/>
         </w:rPr>
-        <w:t>我们的整体思路是「可验证优先」。在调手感、做美术之前，先写了一个脚本机器人，让它像真玩家一样去抓、去爬、去失衡，自动断言核心闭环——失衡会脱落、坠落会重生、登顶会计时——一共跑通 10 条，再加 9 条平衡数学的单元测试，全部通过。</w:t>
+        <w:t>我们有个原则，叫「先保证能验证，再谈别的」。我们没一上来就埋头调手感、做美术，而是先写了个「机器人」——让程序自己当玩家，自动地抓、爬、故意失衡，然后检查：失衡会不会掉？掉了会不会重生？到顶会不会计时？我们定了 10 条这样的检查，再加 9 条平衡算法的数学验证，全部一次通过。</w:t>
       </w:r>
     </w:p>
     <w:p>
@@ -1520,7 +1534,7 @@
           <w:color w:val="1C1F26"/>
           <w:sz w:val="23"/>
         </w:rPr>
-        <w:t>这样做的好处是：机制的正确性靠自动化保证，我们五个人可以并行推进、不需要轮流抢一个头显，每次改动都自动回归，不会把已经稳的部分改坏。人也可以直接用键鼠在两个视角里试玩。</w:t>
+        <w:t>这么做有个特别实在的好处：核心玩法对不对，机器自动帮我们盯着。所以我们五个人能各干各的、同时往前推，不用排队抢那一个头显。而且每次有人改了代码，机器人立马重跑，保证没把原来好好的东西改坏。</w:t>
       </w:r>
     </w:p>
     <w:p>
@@ -1534,7 +1548,7 @@
           <w:color w:val="1C1F26"/>
           <w:sz w:val="23"/>
         </w:rPr>
-        <w:t>评测方面，我们把「能不能测」这件事先做扎实了：被试内对比纯手和「平衡加脚法」两个版本，完成时间、按原因分类的跌落、NASA-TLX 工作负荷、SSQ 晕动这些指标的采集脚本都就绪了，实验协议也写定了。我们的核心假设是——加了平衡和脚法之后，真实感和挑战会上升，但晕动不会上升，因为难度来自决策而不是运动冲突。</w:t>
+        <w:t>再说评测。我们把「怎么测」这件事先备齐了：让 5 到 8 个同学分别玩「纯手版」和「平衡加脚法版」，记录他们的通关时间、摔了几次、分别是因为啥摔的，再用两份业界标准问卷量一下「累不累」和「晕不晕」。这套采集的工具和流程我们都做好了。我们赌的是：加了平衡和脚法之后，玩家会觉得更真实、更有挑战，但不会更晕——因为难度是动脑子的难度，不是那种让人反胃的晃动。</w:t>
       </w:r>
     </w:p>
     <w:p>
@@ -1548,7 +1562,7 @@
           <w:color w:val="1C1F26"/>
           <w:sz w:val="23"/>
         </w:rPr>
-        <w:t>做一个总结：平衡机制、脚法抽象、5 条线路、自动化自检、HUD 和音效、双视角试玩、演示视频、报告和答辩材料，全部已经交付；唯一留待执行的，就是真人实验本身。</w:t>
+        <w:t>最后总结一下我们交付了啥：平衡机制、脚法、5 条线路、那套自动检查、屏幕上的血条和音效、能上手玩的两个视角、演示视频、还有报告和答辩材料——全都做完了。唯一还没做的，就是真的把那 5 到 8 个同学拉来做实验。</w:t>
       </w:r>
     </w:p>
     <w:p>
@@ -1562,7 +1576,7 @@
           <w:color w:val="1C1F26"/>
           <w:sz w:val="23"/>
         </w:rPr>
-        <w:t>一句话收尾：Summit VR 是一个能跑的存在性证明——脚法和平衡，可以廉价、加法式地加进纯手柄 VR 攀岩。谢谢大家，我们可以回答问题。</w:t>
+        <w:t>一句话收尾：Summit VR 证明了一件事——脚法和平衡，真的可以用很低的成本、很稳妥地加进只有手柄的 VR 攀岩里。谢谢大家，欢迎提问。</w:t>
       </w:r>
     </w:p>
     <w:p>
@@ -1585,7 +1599,7 @@
           <w:color w:val="6B7280"/>
           <w:sz w:val="20"/>
         </w:rPr>
-        <w:t>「谢谢大家」后五人可一起致意。Q&amp;A 细节见 docs/DEFENSE_QA.md，各模块问题由对应负责人接。</w:t>
+        <w:t>「谢谢大家」后五人一起致意。Q&amp;A 细节见 docs/DEFENSE_QA.md，对应模块的问题由对应负责人接。</w:t>
       </w:r>
     </w:p>
     <w:sectPr>

</xml_diff>

<commit_message>
Rewrite speech script: 4 speakers, academic register, aligned to deck
- Reduce from 5 to 4 speakers (P1-P4); remove P5/opening-host role
- Linear split matching the 16-slide academic deck:
  P1 背景+相关工作 / P2 方法+架构+平衡算法 /
  P3 脚法+参数+演示+路径 / P4 验证+评测+总结
- Research register throughout (受试者/交互/失稳/攀爬路径); ~11-12 min
- Per-speaker slide mapping, timing, and stage cues retained

Co-Authored-By: Claude Opus 4.8 (1M context) <noreply@anthropic.com>
</commit_message>
<xml_diff>
--- a/docs/SummitVR_演讲稿.docx
+++ b/docs/SummitVR_演讲稿.docx
@@ -15,7 +15,7 @@
           <w:color w:val="C8102E"/>
           <w:sz w:val="44"/>
         </w:rPr>
-        <w:t>Summit VR — 项目汇报 演讲稿</w:t>
+        <w:t>Summit VR — 课程研究报告 演讲稿</w:t>
       </w:r>
     </w:p>
     <w:p>
@@ -31,7 +31,7 @@
           <w:color w:val="6B7280"/>
           <w:sz w:val="24"/>
         </w:rPr>
-        <w:t>课程 AI3618 · 上海交通大学 · 约 10–12 分钟 · 五人分工汇报</w:t>
+        <w:t>AI3618《虚拟现实技术》· 上海交通大学 · 约 10–12 分钟 · 四人分工讲解</w:t>
       </w:r>
     </w:p>
     <w:p>
@@ -47,7 +47,7 @@
           <w:color w:val="1C1F26"/>
           <w:sz w:val="22"/>
         </w:rPr>
-        <w:t>一句话主题：在只有头 + 两手柄的普通 VR 上，把真实抱石的「身体平衡 + 脚法落点」做成可玩机制。</w:t>
+        <w:t>研究问题：在仅有头显与两个手柄的三点追踪条件下，能否重建真实攀爬中的身体平衡与脚法？</w:t>
       </w:r>
     </w:p>
     <w:p>
@@ -84,7 +84,7 @@
           <w:color w:val="1C1F26"/>
           <w:sz w:val="22"/>
         </w:rPr>
-        <w:t>全程约 10 分钟，五人接力。每人到自己负责的幻灯片时接讲，讲完一句话过渡给下一位。Demo 视频在第 8、9 页，播放时讲解者配合旁白。建议各自把自己那段读熟、掐表，留 1 分钟 Q&amp;A 缓冲。</w:t>
+        <w:t>全程约 10–12 分钟，由 P1–P4 四人按幻灯片顺序接力讲解。每人讲完自己负责的部分后，用一句话过渡给下一位。演示视频位于「运行演示」「攀爬路径设计」两页，播放时由对应讲解者配合旁白。建议各自把本段读熟、掐表，整体留 1–2 分钟用于提问。</w:t>
       </w:r>
     </w:p>
     <w:tbl>
@@ -102,7 +102,7 @@
       <w:tr>
         <w:tc>
           <w:tcPr>
-            <w:tcW w:type="dxa" w:w="2880"/>
+            <w:tcW w:type="dxa" w:w="2304"/>
             <w:shd w:val="clear" w:fill="C8102E"/>
           </w:tcPr>
           <w:p>
@@ -123,7 +123,7 @@
         </w:tc>
         <w:tc>
           <w:tcPr>
-            <w:tcW w:type="dxa" w:w="3168"/>
+            <w:tcW w:type="dxa" w:w="3744"/>
             <w:shd w:val="clear" w:fill="C8102E"/>
           </w:tcPr>
           <w:p>
@@ -138,13 +138,13 @@
                 <w:color w:val="FFFFFF"/>
                 <w:sz w:val="20"/>
               </w:rPr>
-              <w:t>负责幻灯片</w:t>
+              <w:t>对应幻灯片</w:t>
             </w:r>
           </w:p>
         </w:tc>
         <w:tc>
           <w:tcPr>
-            <w:tcW w:type="dxa" w:w="3456"/>
+            <w:tcW w:type="dxa" w:w="3744"/>
             <w:shd w:val="clear" w:fill="C8102E"/>
           </w:tcPr>
           <w:p>
@@ -159,13 +159,13 @@
                 <w:color w:val="FFFFFF"/>
                 <w:sz w:val="20"/>
               </w:rPr>
-              <w:t>主题</w:t>
+              <w:t>讲解主题</w:t>
             </w:r>
           </w:p>
         </w:tc>
         <w:tc>
           <w:tcPr>
-            <w:tcW w:type="dxa" w:w="1296"/>
+            <w:tcW w:type="dxa" w:w="1440"/>
             <w:shd w:val="clear" w:fill="C8102E"/>
           </w:tcPr>
           <w:p>
@@ -180,7 +180,7 @@
                 <w:color w:val="FFFFFF"/>
                 <w:sz w:val="20"/>
               </w:rPr>
-              <w:t>时长</w:t>
+              <w:t>建议时长</w:t>
             </w:r>
           </w:p>
         </w:tc>
@@ -188,7 +188,7 @@
       <w:tr>
         <w:tc>
           <w:tcPr>
-            <w:tcW w:type="dxa" w:w="2880"/>
+            <w:tcW w:type="dxa" w:w="2304"/>
           </w:tcPr>
           <w:p>
             <w:pPr>
@@ -202,13 +202,13 @@
                 <w:color w:val="1C1F26"/>
                 <w:sz w:val="20"/>
               </w:rPr>
-              <w:t>P5 孙艺豪（主讲/开场）</w:t>
+              <w:t>P1 薛俊智</w:t>
             </w:r>
           </w:p>
         </w:tc>
         <w:tc>
           <w:tcPr>
-            <w:tcW w:type="dxa" w:w="3168"/>
+            <w:tcW w:type="dxa" w:w="3744"/>
           </w:tcPr>
           <w:p>
             <w:pPr>
@@ -221,13 +221,13 @@
                 <w:color w:val="1C1F26"/>
                 <w:sz w:val="20"/>
               </w:rPr>
-              <w:t>封面 · 目录 · 背景问题</w:t>
+              <w:t>封面 · 背景 · 问题 · 相关工作</w:t>
             </w:r>
           </w:p>
         </w:tc>
         <w:tc>
           <w:tcPr>
-            <w:tcW w:type="dxa" w:w="3456"/>
+            <w:tcW w:type="dxa" w:w="3744"/>
           </w:tcPr>
           <w:p>
             <w:pPr>
@@ -240,92 +240,13 @@
                 <w:color w:val="1C1F26"/>
                 <w:sz w:val="20"/>
               </w:rPr>
-              <w:t>开场 + 我们要解决什么</w:t>
+              <w:t>开场 + 研究背景与已有工作</w:t>
             </w:r>
           </w:p>
         </w:tc>
         <w:tc>
           <w:tcPr>
-            <w:tcW w:type="dxa" w:w="1296"/>
-          </w:tcPr>
-          <w:p>
-            <w:pPr>
-              <w:spacing w:after="0"/>
-            </w:pPr>
-            <w:r/>
-            <w:r>
-              <w:rPr>
-                <w:rFonts w:ascii="Microsoft YaHei" w:hAnsi="Microsoft YaHei" w:eastAsia="Microsoft YaHei"/>
-                <w:color w:val="1C1F26"/>
-                <w:sz w:val="20"/>
-              </w:rPr>
-              <w:t>~1.5 min</w:t>
-            </w:r>
-          </w:p>
-        </w:tc>
-      </w:tr>
-      <w:tr>
-        <w:tc>
-          <w:tcPr>
-            <w:tcW w:type="dxa" w:w="2880"/>
-          </w:tcPr>
-          <w:p>
-            <w:pPr>
-              <w:spacing w:after="0"/>
-            </w:pPr>
-            <w:r/>
-            <w:r>
-              <w:rPr>
-                <w:rFonts w:ascii="Microsoft YaHei" w:hAnsi="Microsoft YaHei" w:eastAsia="Microsoft YaHei"/>
-                <w:b/>
-                <w:color w:val="1C1F26"/>
-                <w:sz w:val="20"/>
-              </w:rPr>
-              <w:t>P1 薛俊智（攀爬系统）</w:t>
-            </w:r>
-          </w:p>
-        </w:tc>
-        <w:tc>
-          <w:tcPr>
-            <w:tcW w:type="dxa" w:w="3168"/>
-          </w:tcPr>
-          <w:p>
-            <w:pPr>
-              <w:spacing w:after="0"/>
-            </w:pPr>
-            <w:r/>
-            <w:r>
-              <w:rPr>
-                <w:rFonts w:ascii="Microsoft YaHei" w:hAnsi="Microsoft YaHei" w:eastAsia="Microsoft YaHei"/>
-                <w:color w:val="1C1F26"/>
-                <w:sz w:val="20"/>
-              </w:rPr>
-              <w:t>点子 · 调研 · 架构 · 平衡机制</w:t>
-            </w:r>
-          </w:p>
-        </w:tc>
-        <w:tc>
-          <w:tcPr>
-            <w:tcW w:type="dxa" w:w="3456"/>
-          </w:tcPr>
-          <w:p>
-            <w:pPr>
-              <w:spacing w:after="0"/>
-            </w:pPr>
-            <w:r/>
-            <w:r>
-              <w:rPr>
-                <w:rFonts w:ascii="Microsoft YaHei" w:hAnsi="Microsoft YaHei" w:eastAsia="Microsoft YaHei"/>
-                <w:color w:val="1C1F26"/>
-                <w:sz w:val="20"/>
-              </w:rPr>
-              <w:t>核心技术：头当重心的平衡模型</w:t>
-            </w:r>
-          </w:p>
-        </w:tc>
-        <w:tc>
-          <w:tcPr>
-            <w:tcW w:type="dxa" w:w="1296"/>
+            <w:tcW w:type="dxa" w:w="1440"/>
           </w:tcPr>
           <w:p>
             <w:pPr>
@@ -346,7 +267,7 @@
       <w:tr>
         <w:tc>
           <w:tcPr>
-            <w:tcW w:type="dxa" w:w="2880"/>
+            <w:tcW w:type="dxa" w:w="2304"/>
           </w:tcPr>
           <w:p>
             <w:pPr>
@@ -360,13 +281,13 @@
                 <w:color w:val="1C1F26"/>
                 <w:sz w:val="20"/>
               </w:rPr>
-              <w:t>P2 吴一轩（玩法规则）</w:t>
+              <w:t>P2 吴一轩</w:t>
             </w:r>
           </w:p>
         </w:tc>
         <w:tc>
           <w:tcPr>
-            <w:tcW w:type="dxa" w:w="3168"/>
+            <w:tcW w:type="dxa" w:w="3744"/>
           </w:tcPr>
           <w:p>
             <w:pPr>
@@ -379,13 +300,13 @@
                 <w:color w:val="1C1F26"/>
                 <w:sz w:val="20"/>
               </w:rPr>
-              <w:t>脚法常量 · 线路库</w:t>
+              <w:t>方法 · 系统架构 · 平衡算法</w:t>
             </w:r>
           </w:p>
         </w:tc>
         <w:tc>
           <w:tcPr>
-            <w:tcW w:type="dxa" w:w="3456"/>
+            <w:tcW w:type="dxa" w:w="3744"/>
           </w:tcPr>
           <w:p>
             <w:pPr>
@@ -398,13 +319,13 @@
                 <w:color w:val="1C1F26"/>
                 <w:sz w:val="20"/>
               </w:rPr>
-              <w:t>脚法抽象 + 5 条线路设计</w:t>
+              <w:t>方法设计与核心平衡判定算法</w:t>
             </w:r>
           </w:p>
         </w:tc>
         <w:tc>
           <w:tcPr>
-            <w:tcW w:type="dxa" w:w="1296"/>
+            <w:tcW w:type="dxa" w:w="1440"/>
           </w:tcPr>
           <w:p>
             <w:pPr>
@@ -417,7 +338,7 @@
                 <w:color w:val="1C1F26"/>
                 <w:sz w:val="20"/>
               </w:rPr>
-              <w:t>~2 min</w:t>
+              <w:t>~3 min</w:t>
             </w:r>
           </w:p>
         </w:tc>
@@ -425,7 +346,7 @@
       <w:tr>
         <w:tc>
           <w:tcPr>
-            <w:tcW w:type="dxa" w:w="2880"/>
+            <w:tcW w:type="dxa" w:w="2304"/>
           </w:tcPr>
           <w:p>
             <w:pPr>
@@ -439,13 +360,13 @@
                 <w:color w:val="1C1F26"/>
                 <w:sz w:val="20"/>
               </w:rPr>
-              <w:t>P3 邹沛霖（场景美术）</w:t>
+              <w:t>P3 陶锐</w:t>
             </w:r>
           </w:p>
         </w:tc>
         <w:tc>
           <w:tcPr>
-            <w:tcW w:type="dxa" w:w="3168"/>
+            <w:tcW w:type="dxa" w:w="3744"/>
           </w:tcPr>
           <w:p>
             <w:pPr>
@@ -458,13 +379,13 @@
                 <w:color w:val="1C1F26"/>
                 <w:sz w:val="20"/>
               </w:rPr>
-              <w:t>Demo · 化身演进</w:t>
+              <w:t>脚法 · 参数 · 演示 · 路径</w:t>
             </w:r>
           </w:p>
         </w:tc>
         <w:tc>
           <w:tcPr>
-            <w:tcW w:type="dxa" w:w="3456"/>
+            <w:tcW w:type="dxa" w:w="3744"/>
           </w:tcPr>
           <w:p>
             <w:pPr>
@@ -477,13 +398,13 @@
                 <w:color w:val="1C1F26"/>
                 <w:sz w:val="20"/>
               </w:rPr>
-              <w:t>演示视频 + 画面打磨</w:t>
+              <w:t>脚法建模、参数与运行演示</w:t>
             </w:r>
           </w:p>
         </w:tc>
         <w:tc>
           <w:tcPr>
-            <w:tcW w:type="dxa" w:w="1296"/>
+            <w:tcW w:type="dxa" w:w="1440"/>
           </w:tcPr>
           <w:p>
             <w:pPr>
@@ -496,7 +417,7 @@
                 <w:color w:val="1C1F26"/>
                 <w:sz w:val="20"/>
               </w:rPr>
-              <w:t>~1.5 min</w:t>
+              <w:t>~2.5 min</w:t>
             </w:r>
           </w:p>
         </w:tc>
@@ -504,7 +425,7 @@
       <w:tr>
         <w:tc>
           <w:tcPr>
-            <w:tcW w:type="dxa" w:w="2880"/>
+            <w:tcW w:type="dxa" w:w="2304"/>
           </w:tcPr>
           <w:p>
             <w:pPr>
@@ -518,13 +439,13 @@
                 <w:color w:val="1C1F26"/>
                 <w:sz w:val="20"/>
               </w:rPr>
-              <w:t>P4 陶锐（XR/工程）</w:t>
+              <w:t>P4 邹沛霖</w:t>
             </w:r>
           </w:p>
         </w:tc>
         <w:tc>
           <w:tcPr>
-            <w:tcW w:type="dxa" w:w="3168"/>
+            <w:tcW w:type="dxa" w:w="3744"/>
           </w:tcPr>
           <w:p>
             <w:pPr>
@@ -537,13 +458,13 @@
                 <w:color w:val="1C1F26"/>
                 <w:sz w:val="20"/>
               </w:rPr>
-              <w:t>整体思路 · 评测体系 · 总结</w:t>
+              <w:t>验证 · 评测 · 总结</w:t>
             </w:r>
           </w:p>
         </w:tc>
         <w:tc>
           <w:tcPr>
-            <w:tcW w:type="dxa" w:w="3456"/>
+            <w:tcW w:type="dxa" w:w="3744"/>
           </w:tcPr>
           <w:p>
             <w:pPr>
@@ -556,13 +477,13 @@
                 <w:color w:val="1C1F26"/>
                 <w:sz w:val="20"/>
               </w:rPr>
-              <w:t>开发方法论 + 交付总结 + 收尾</w:t>
+              <w:t>开发验证、评测方案与结论</w:t>
             </w:r>
           </w:p>
         </w:tc>
         <w:tc>
           <w:tcPr>
-            <w:tcW w:type="dxa" w:w="1296"/>
+            <w:tcW w:type="dxa" w:w="1440"/>
           </w:tcPr>
           <w:p>
             <w:pPr>
@@ -575,7 +496,7 @@
                 <w:color w:val="1C1F26"/>
                 <w:sz w:val="20"/>
               </w:rPr>
-              <w:t>~2 min</w:t>
+              <w:t>~2.5 min</w:t>
             </w:r>
           </w:p>
         </w:tc>
@@ -618,7 +539,7 @@
           <w:color w:val="9E0B22"/>
           <w:sz w:val="32"/>
         </w:rPr>
-        <w:t>P5 孙艺豪（主讲 · 开场）</w:t>
+        <w:t>P1 薛俊智 · 开场与研究背景</w:t>
       </w:r>
     </w:p>
     <w:p>
@@ -641,7 +562,7 @@
           <w:color w:val="1C1F26"/>
           <w:sz w:val="20"/>
         </w:rPr>
-        <w:t>封面 / 目录 / 背景与问题</w:t>
+        <w:t>封面 / 研究背景 / 问题分析 / 相关工作</w:t>
       </w:r>
       <w:r>
         <w:rPr>
@@ -650,192 +571,7 @@
           <w:color w:val="6B7280"/>
           <w:sz w:val="20"/>
         </w:rPr>
-        <w:t xml:space="preserve">　｜　时长：</w:t>
-      </w:r>
-      <w:r>
-        <w:rPr>
-          <w:rFonts w:ascii="Microsoft YaHei" w:hAnsi="Microsoft YaHei" w:eastAsia="Microsoft YaHei"/>
-          <w:b/>
-          <w:color w:val="1C1F26"/>
-          <w:sz w:val="20"/>
-        </w:rPr>
-        <w:t>约 1.5 分钟</w:t>
-      </w:r>
-    </w:p>
-    <w:p>
-      <w:pPr>
-        <w:spacing w:after="160" w:line="336" w:lineRule="auto"/>
-      </w:pPr>
-      <w:r>
-        <w:rPr>
-          <w:rFonts w:ascii="Microsoft YaHei" w:hAnsi="Microsoft YaHei" w:eastAsia="Microsoft YaHei"/>
-          <w:b/>
-          <w:color w:val="C8102E"/>
-          <w:sz w:val="20"/>
-        </w:rPr>
-        <w:t>【提示】</w:t>
-      </w:r>
-      <w:r>
-        <w:rPr>
-          <w:rFonts w:ascii="Microsoft YaHei" w:hAnsi="Microsoft YaHei" w:eastAsia="Microsoft YaHei"/>
-          <w:b w:val="0"/>
-          <w:color w:val="6B7280"/>
-          <w:sz w:val="20"/>
-        </w:rPr>
-        <w:t>站定，等封面页投出再开口。语速放慢，笑一下，这是全场第一印象。</w:t>
-      </w:r>
-    </w:p>
-    <w:p>
-      <w:pPr>
-        <w:spacing w:after="160" w:line="348" w:lineRule="auto"/>
-        <w:ind w:left="173"/>
-      </w:pPr>
-      <w:r>
-        <w:rPr>
-          <w:rFonts w:ascii="Microsoft YaHei" w:hAnsi="Microsoft YaHei" w:eastAsia="Microsoft YaHei"/>
-          <w:color w:val="1C1F26"/>
-          <w:sz w:val="23"/>
-        </w:rPr>
-        <w:t>各位老师、同学好。先问大家一个问题：你们玩过 VR 攀岩吗？戴上头显，伸手抓住岩壁上的点，往上一拉，整个人就「爬」上去了——是不是还挺爽的？</w:t>
-      </w:r>
-    </w:p>
-    <w:p>
-      <w:pPr>
-        <w:spacing w:after="160" w:line="348" w:lineRule="auto"/>
-        <w:ind w:left="173"/>
-      </w:pPr>
-      <w:r>
-        <w:rPr>
-          <w:rFonts w:ascii="Microsoft YaHei" w:hAnsi="Microsoft YaHei" w:eastAsia="Microsoft YaHei"/>
-          <w:color w:val="1C1F26"/>
-          <w:sz w:val="23"/>
-        </w:rPr>
-        <w:t>我们这组的项目也是 VR 攀岩，叫 Summit VR。但在做之前，我们发现现在市面上的 VR 攀岩游戏——像很火的 The Climb、Gorilla Tag——其实都有同一个毛病：它们全靠两只手。你就是不停地抓、不停地拉，掉下来也只有两种可能：要么手松了，要么手不够长够不着。</w:t>
-      </w:r>
-    </w:p>
-    <w:p>
-      <w:pPr>
-        <w:spacing w:after="160" w:line="348" w:lineRule="auto"/>
-        <w:ind w:left="173"/>
-      </w:pPr>
-      <w:r>
-        <w:rPr>
-          <w:rFonts w:ascii="Microsoft YaHei" w:hAnsi="Microsoft YaHei" w:eastAsia="Microsoft YaHei"/>
-          <w:color w:val="1C1F26"/>
-          <w:sz w:val="23"/>
-        </w:rPr>
-        <w:t>可是你去问任何一个真正爬过岩的人，他都会告诉你：攀岩真正难的地方，根本不是手劲大不大，而是脚怎么踩、重心怎么放。打个比方，你贴在墙上，两只手都抓在右边，身体就会像一扇门一样「啪」地往外甩开——攀岩里这叫「开门」。怎么破？踩一只左脚顶住，人就稳了。这种「用脚和重心保持平衡」的功夫，才是攀岩的精髓。</w:t>
-      </w:r>
-    </w:p>
-    <w:p>
-      <w:pPr>
-        <w:spacing w:after="160" w:line="348" w:lineRule="auto"/>
-        <w:ind w:left="173"/>
-      </w:pPr>
-      <w:r>
-        <w:rPr>
-          <w:rFonts w:ascii="Microsoft YaHei" w:hAnsi="Microsoft YaHei" w:eastAsia="Microsoft YaHei"/>
-          <w:color w:val="1C1F26"/>
-          <w:sz w:val="23"/>
-        </w:rPr>
-        <w:t>而现在的 VR 攀岩，恰恰把这最精髓的一层——脚和平衡——全给砍掉了。这就是我们想补回来的东西：在一台普普通通、只有头显加两个手柄的 VR 设备上，把「平衡」和「脚法」做成真正会影响你输赢的玩法。</w:t>
-      </w:r>
-    </w:p>
-    <w:p>
-      <w:pPr>
-        <w:spacing w:after="160" w:line="348" w:lineRule="auto"/>
-        <w:ind w:left="173"/>
-      </w:pPr>
-      <w:r>
-        <w:rPr>
-          <w:rFonts w:ascii="Microsoft YaHei" w:hAnsi="Microsoft YaHei" w:eastAsia="Microsoft YaHei"/>
-          <w:color w:val="1C1F26"/>
-          <w:sz w:val="23"/>
-        </w:rPr>
-        <w:t>接下来，请负责攀爬核心的薛俊智，给大家讲讲我们到底是怎么把这件事做出来的。</w:t>
-      </w:r>
-    </w:p>
-    <w:p>
-      <w:pPr>
-        <w:spacing w:after="160" w:line="336" w:lineRule="auto"/>
-      </w:pPr>
-      <w:r>
-        <w:rPr>
-          <w:rFonts w:ascii="Microsoft YaHei" w:hAnsi="Microsoft YaHei" w:eastAsia="Microsoft YaHei"/>
-          <w:b/>
-          <w:color w:val="C8102E"/>
-          <w:sz w:val="20"/>
-        </w:rPr>
-        <w:t>【提示】</w:t>
-      </w:r>
-      <w:r>
-        <w:rPr>
-          <w:rFonts w:ascii="Microsoft YaHei" w:hAnsi="Microsoft YaHei" w:eastAsia="Microsoft YaHei"/>
-          <w:b w:val="0"/>
-          <w:color w:val="6B7280"/>
-          <w:sz w:val="20"/>
-        </w:rPr>
-        <w:t>说完转头示意 P1。目录页可一带而过，或在结尾顺势点一句「整个汇报分六块」。</w:t>
-      </w:r>
-    </w:p>
-    <w:p>
-      <w:pPr>
-        <w:spacing w:after="40" w:before="0" w:line="336" w:lineRule="auto"/>
-      </w:pPr>
-    </w:p>
-    <w:p>
-      <w:pPr>
-        <w:spacing w:after="40" w:line="336" w:lineRule="auto"/>
-      </w:pPr>
-      <w:r>
-        <w:rPr>
-          <w:rFonts w:ascii="Microsoft YaHei" w:hAnsi="Microsoft YaHei" w:eastAsia="Microsoft YaHei"/>
-          <w:b/>
-          <w:color w:val="C8102E"/>
-          <w:sz w:val="32"/>
-        </w:rPr>
-        <w:t xml:space="preserve">第 二 部分　</w:t>
-      </w:r>
-      <w:r>
-        <w:rPr>
-          <w:rFonts w:ascii="Microsoft YaHei" w:hAnsi="Microsoft YaHei" w:eastAsia="Microsoft YaHei"/>
-          <w:b/>
-          <w:color w:val="9E0B22"/>
-          <w:sz w:val="32"/>
-        </w:rPr>
-        <w:t>P1 薛俊智（攀爬系统）</w:t>
-      </w:r>
-    </w:p>
-    <w:p>
-      <w:pPr>
-        <w:spacing w:after="80" w:line="336" w:lineRule="auto"/>
-      </w:pPr>
-      <w:r>
-        <w:rPr>
-          <w:rFonts w:ascii="Microsoft YaHei" w:hAnsi="Microsoft YaHei" w:eastAsia="Microsoft YaHei"/>
-          <w:b w:val="0"/>
-          <w:color w:val="6B7280"/>
-          <w:sz w:val="20"/>
-        </w:rPr>
-        <w:t>对应幻灯片：</w:t>
-      </w:r>
-      <w:r>
-        <w:rPr>
-          <w:rFonts w:ascii="Microsoft YaHei" w:hAnsi="Microsoft YaHei" w:eastAsia="Microsoft YaHei"/>
-          <w:b/>
-          <w:color w:val="1C1F26"/>
-          <w:sz w:val="20"/>
-        </w:rPr>
-        <w:t>我们的点子 / 调研支撑 / 系统架构 / 核心平衡机制</w:t>
-      </w:r>
-      <w:r>
-        <w:rPr>
-          <w:rFonts w:ascii="Microsoft YaHei" w:hAnsi="Microsoft YaHei" w:eastAsia="Microsoft YaHei"/>
-          <w:b w:val="0"/>
-          <w:color w:val="6B7280"/>
-          <w:sz w:val="20"/>
-        </w:rPr>
-        <w:t xml:space="preserve">　｜　时长：</w:t>
+        <w:t xml:space="preserve">　｜　建议时长：</w:t>
       </w:r>
       <w:r>
         <w:rPr>
@@ -867,7 +603,7 @@
           <w:color w:val="6B7280"/>
           <w:sz w:val="20"/>
         </w:rPr>
-        <w:t>这是技术核心，最可能被追问。平衡机制那页务必放慢，用「门」「秤」的比喻把它讲透。</w:t>
+        <w:t>等封面投出后开口，语速放稳。本部分确立研究问题与立项依据。</w:t>
       </w:r>
     </w:p>
     <w:p>
@@ -881,7 +617,7 @@
           <w:color w:val="1C1F26"/>
           <w:sz w:val="23"/>
         </w:rPr>
-        <w:t>谢谢艺豪。我先讲我们整个的思路，其实就一句大白话：测不到的，就别硬测，把它「估」出来；只去做真正影响玩法的那部分。</w:t>
+        <w:t>各位老师、同学好。我们这一组的课程研究题目是 Summit VR——面向纯手柄 VR 攀爬的平衡与脚法建模。我先介绍研究背景，以及我们想要回答的问题。</w:t>
       </w:r>
     </w:p>
     <w:p>
@@ -895,7 +631,7 @@
           <w:color w:val="1C1F26"/>
           <w:sz w:val="23"/>
         </w:rPr>
-        <w:t>为什么这么说？因为普通 VR 设备只能知道你的头和两只手在哪，它根本看不到你的脚。那脚怎么办？我们想了三招。第一招，拿头当「重心」。你想，人贴在墙上的时候，脑袋基本是跟着身体一起晃的，头往哪边歪，重心就往哪边跑，所以盯着头的左右位置，就能大概知道你有没有失去平衡。</w:t>
+        <w:t>先看现状。现有的 VR 攀爬交互，基本都建立在「抓握—反向位移」这一范式上：用户用双手抓住墙面的握点，再把身体拉起；运动与手部动作紧密耦合，所以舒适、晕动较低。但代价是，在这种交互里，失败只可能来自两种情况——手脱开，或者臂展不够、够不到下一个握点。</w:t>
       </w:r>
     </w:p>
     <w:p>
@@ -909,7 +645,7 @@
           <w:color w:val="1C1F26"/>
           <w:sz w:val="23"/>
         </w:rPr>
-        <w:t>第二招，脚不画出来，只算它的「作用」。我们不去做一双逼真的虚拟腿——那种腿在攀岩这种高抬腿、侧身的姿势下特别容易穿模、特别假。我们只让一只「看不见的脚」自动踩到你身体下方最近的脚点上，它唯一的作用就是帮你「把站得更稳」。第三招，失衡不是「啪」一下摔死，而是有一根会慢慢掉的平衡条，给你反应时间，让你能救回来。</w:t>
+        <w:t>可是在真实攀爬中，决定成败的往往不是手的力量，而是重心与脚的协同。当身体的支撑点都偏在一侧时，重心会越出支撑范围，身体就会绕着支点旋转出去，这在攀岩里称为「开门效应」，也就是barn-door。要纠正它，标准做法是伸出一只脚去侧撑，把重心重新拉回支撑范围内。</w:t>
       </w:r>
     </w:p>
     <w:p>
@@ -923,7 +659,7 @@
           <w:color w:val="1C1F26"/>
           <w:sz w:val="23"/>
         </w:rPr>
-        <w:t>这套设计也不是我们拍脑袋想的。有两篇论文给我们撑腰：一篇 2020 年的研究专门做实验发现，在 VR 攀岩里「让你看到脚」比「让你看到手」更能带来真实感；另一篇 2026 年的研究，就是用「头当重心」来判断人会不会摔，而且做了真人实验验证过。我们等于是把这两个结论，搬到了人人都买得起的硬件上。</w:t>
+        <w:t>换句话说，身体平衡和脚法，是真实攀爬的核心技能，却恰好是现有 VR 攀爬交互所忽略的一层。我们这项工作要研究的，就是如何把这一层重新建模出来。</w:t>
       </w:r>
     </w:p>
     <w:p>
@@ -937,7 +673,7 @@
           <w:color w:val="1C1F26"/>
           <w:sz w:val="23"/>
         </w:rPr>
-        <w:t>讲讲怎么搭的。这里有个很重要的设计叫「加法」：手抓、往上拉这套基本操作是成熟的、稳的，我们的平衡和脚法是「加」在它上面的两层。你把这两层关掉，游戏立马变回一个普通的纯手攀岩，照样能玩。所以我们加新东西，永远不会把原来能跑的部分搞坏——这点对做项目很关键。</w:t>
+        <w:t>难点在于硬件。主流头显只能提供三个追踪点：一个头显，两个手柄。它没有脚部或躯干追踪，下半身的姿态是不可观测的。如果用逆向运动学或者生成式方法去反解腿部，在攀爬这种高抬腿、侧身的极端姿势下，结果往往会失真、穿模。所以我们的研究目标是：在不增加任何硬件的前提下，只用这三个追踪点，去近似判断「重心有没有落在支撑范围内」，并把脚法表征为「是否提供了有效支撑」，从而让平衡与脚法成为可建模、可验证的交互维度。</w:t>
       </w:r>
     </w:p>
     <w:p>
@@ -951,35 +687,7 @@
           <w:color w:val="1C1F26"/>
           <w:sz w:val="23"/>
         </w:rPr>
-        <w:t>那平衡到底怎么算的？说穿了特别简单，就像一杆秤。我把你所有的「支撑点」——抓住的手、踩住的脚——在墙的左右方向上拉出一条线段，这就是你的「安全区间」。然后看你的头（也就是重心）落在哪：落在区间里，稳；歪出区间了，平衡条就开始往下掉，掉光了你就脱手摔下去。</w:t>
-      </w:r>
-    </w:p>
-    <w:p>
-      <w:pPr>
-        <w:spacing w:after="160" w:line="348" w:lineRule="auto"/>
-        <w:ind w:left="173"/>
-      </w:pPr>
-      <w:r>
-        <w:rPr>
-          <w:rFonts w:ascii="Microsoft YaHei" w:hAnsi="Microsoft YaHei" w:eastAsia="Microsoft YaHei"/>
-          <w:color w:val="1C1F26"/>
-          <w:sz w:val="23"/>
-        </w:rPr>
-        <w:t>现在就能回答那个核心问题了：为什么踩一只脚就能救回来？因为你多踩一个点，那条「安全区间」就被撑宽了，你原来歪在外面的重心，一下就重新被框进了安全区里。演示里失衡变红、踩脚回正的那一瞬间，就是我们整个项目最得意的一下。</w:t>
-      </w:r>
-    </w:p>
-    <w:p>
-      <w:pPr>
-        <w:spacing w:after="160" w:line="348" w:lineRule="auto"/>
-        <w:ind w:left="173"/>
-      </w:pPr>
-      <w:r>
-        <w:rPr>
-          <w:rFonts w:ascii="Microsoft YaHei" w:hAnsi="Microsoft YaHei" w:eastAsia="Microsoft YaHei"/>
-          <w:color w:val="1C1F26"/>
-          <w:sz w:val="23"/>
-        </w:rPr>
-        <w:t>脚和线路具体怎么设计的，请吴一轩接着讲。</w:t>
+        <w:t>这个思路不是凭空设想，已有研究提供了依据。第一，Kosmalla 等人在 CHI 2020 的实验表明，在攀爬中呈现「脚」比呈现「手」更能提升动作准确度的感知，说明脚值得被表征。第二，Mitsuda 和 Kimura 在 2026 年的工作，用头显近似重心、当重心越过无支撑的脚就判定失稳，并通过 24 人的实验验证了可行性。第三，机器人学里的支撑多边形、零力矩点等概念，为「重心是否在支撑区内」提供了形式化的判据。我们正是把这些结论，落实到无脚追踪的受限设备上。下面请吴一轩介绍我们具体的方法与系统设计。</w:t>
       </w:r>
     </w:p>
     <w:p>
@@ -1002,7 +710,206 @@
           <w:color w:val="6B7280"/>
           <w:sz w:val="20"/>
         </w:rPr>
-        <w:t>「最得意的一下」说完停半拍，再过渡。这句是全场记忆点。</w:t>
+        <w:t>讲到「相关工作」一页时，三张卡片各点一句即可，不必展开论文细节。</w:t>
+      </w:r>
+    </w:p>
+    <w:p>
+      <w:pPr>
+        <w:spacing w:after="40" w:before="0" w:line="336" w:lineRule="auto"/>
+      </w:pPr>
+    </w:p>
+    <w:p>
+      <w:pPr>
+        <w:spacing w:after="40" w:line="336" w:lineRule="auto"/>
+      </w:pPr>
+      <w:r>
+        <w:rPr>
+          <w:rFonts w:ascii="Microsoft YaHei" w:hAnsi="Microsoft YaHei" w:eastAsia="Microsoft YaHei"/>
+          <w:b/>
+          <w:color w:val="C8102E"/>
+          <w:sz w:val="32"/>
+        </w:rPr>
+        <w:t xml:space="preserve">第 二 部分　</w:t>
+      </w:r>
+      <w:r>
+        <w:rPr>
+          <w:rFonts w:ascii="Microsoft YaHei" w:hAnsi="Microsoft YaHei" w:eastAsia="Microsoft YaHei"/>
+          <w:b/>
+          <w:color w:val="9E0B22"/>
+          <w:sz w:val="32"/>
+        </w:rPr>
+        <w:t>P2 吴一轩 · 方法与核心算法</w:t>
+      </w:r>
+    </w:p>
+    <w:p>
+      <w:pPr>
+        <w:spacing w:after="80" w:line="336" w:lineRule="auto"/>
+      </w:pPr>
+      <w:r>
+        <w:rPr>
+          <w:rFonts w:ascii="Microsoft YaHei" w:hAnsi="Microsoft YaHei" w:eastAsia="Microsoft YaHei"/>
+          <w:b w:val="0"/>
+          <w:color w:val="6B7280"/>
+          <w:sz w:val="20"/>
+        </w:rPr>
+        <w:t>对应幻灯片：</w:t>
+      </w:r>
+      <w:r>
+        <w:rPr>
+          <w:rFonts w:ascii="Microsoft YaHei" w:hAnsi="Microsoft YaHei" w:eastAsia="Microsoft YaHei"/>
+          <w:b/>
+          <w:color w:val="1C1F26"/>
+          <w:sz w:val="20"/>
+        </w:rPr>
+        <w:t>方法概述 / 系统架构 / 平衡判定算法</w:t>
+      </w:r>
+      <w:r>
+        <w:rPr>
+          <w:rFonts w:ascii="Microsoft YaHei" w:hAnsi="Microsoft YaHei" w:eastAsia="Microsoft YaHei"/>
+          <w:b w:val="0"/>
+          <w:color w:val="6B7280"/>
+          <w:sz w:val="20"/>
+        </w:rPr>
+        <w:t xml:space="preserve">　｜　建议时长：</w:t>
+      </w:r>
+      <w:r>
+        <w:rPr>
+          <w:rFonts w:ascii="Microsoft YaHei" w:hAnsi="Microsoft YaHei" w:eastAsia="Microsoft YaHei"/>
+          <w:b/>
+          <w:color w:val="1C1F26"/>
+          <w:sz w:val="20"/>
+        </w:rPr>
+        <w:t>约 3 分钟</w:t>
+      </w:r>
+    </w:p>
+    <w:p>
+      <w:pPr>
+        <w:spacing w:after="160" w:line="336" w:lineRule="auto"/>
+      </w:pPr>
+      <w:r>
+        <w:rPr>
+          <w:rFonts w:ascii="Microsoft YaHei" w:hAnsi="Microsoft YaHei" w:eastAsia="Microsoft YaHei"/>
+          <w:b/>
+          <w:color w:val="C8102E"/>
+          <w:sz w:val="20"/>
+        </w:rPr>
+        <w:t>【提示】</w:t>
+      </w:r>
+      <w:r>
+        <w:rPr>
+          <w:rFonts w:ascii="Microsoft YaHei" w:hAnsi="Microsoft YaHei" w:eastAsia="Microsoft YaHei"/>
+          <w:b w:val="0"/>
+          <w:color w:val="6B7280"/>
+          <w:sz w:val="20"/>
+        </w:rPr>
+        <w:t>本部分是技术核心，最可能被追问。平衡算法一页务必放慢，把四步讲清。</w:t>
+      </w:r>
+    </w:p>
+    <w:p>
+      <w:pPr>
+        <w:spacing w:after="160" w:line="348" w:lineRule="auto"/>
+        <w:ind w:left="173"/>
+      </w:pPr>
+      <w:r>
+        <w:rPr>
+          <w:rFonts w:ascii="Microsoft YaHei" w:hAnsi="Microsoft YaHei" w:eastAsia="Microsoft YaHei"/>
+          <w:color w:val="1C1F26"/>
+          <w:sz w:val="23"/>
+        </w:rPr>
+        <w:t>谢谢俊智。我来介绍我们的方法设计和核心算法。我们的总体设计原则可以概括为一句话：抽象掉不可观测的量，只对真正影响交互的部分建模。</w:t>
+      </w:r>
+    </w:p>
+    <w:p>
+      <w:pPr>
+        <w:spacing w:after="160" w:line="348" w:lineRule="auto"/>
+        <w:ind w:left="173"/>
+      </w:pPr>
+      <w:r>
+        <w:rPr>
+          <w:rFonts w:ascii="Microsoft YaHei" w:hAnsi="Microsoft YaHei" w:eastAsia="Microsoft YaHei"/>
+          <w:color w:val="1C1F26"/>
+          <w:sz w:val="23"/>
+        </w:rPr>
+        <w:t>据此我们做了三个设计决定。第一，以头显近似重心。在三个追踪点里，头显是唯一稳定可得的高位信号，它的横向位置可以近似反映躯干是否偏离了支撑。第二，以状态来表征脚法。我们不去重建腿部几何，而是把脚抽象成一个离散状态——它位于某个握点上，为身体提供一个支撑点。第三，以分级量来表征失稳。失稳不是一瞬间的判定，而是一个带缓冲、能回升的连续量，这样它就可以预警、可以恢复。</w:t>
+      </w:r>
+    </w:p>
+    <w:p>
+      <w:pPr>
+        <w:spacing w:after="160" w:line="348" w:lineRule="auto"/>
+        <w:ind w:left="173"/>
+      </w:pPr>
+      <w:r>
+        <w:rPr>
+          <w:rFonts w:ascii="Microsoft YaHei" w:hAnsi="Microsoft YaHei" w:eastAsia="Microsoft YaHei"/>
+          <w:color w:val="1C1F26"/>
+          <w:sz w:val="23"/>
+        </w:rPr>
+        <w:t>需要强调的是，这三层是「加法式」叠加在「抓握—反向位移」这一基础范式之上的可选模块。如果把它们移除，系统会退化成常规的纯手部攀爬，基础交互不受影响——这保证了我们新增的机制不会破坏已经稳定的部分。</w:t>
+      </w:r>
+    </w:p>
+    <w:p>
+      <w:pPr>
+        <w:spacing w:after="160" w:line="348" w:lineRule="auto"/>
+        <w:ind w:left="173"/>
+      </w:pPr>
+      <w:r>
+        <w:rPr>
+          <w:rFonts w:ascii="Microsoft YaHei" w:hAnsi="Microsoft YaHei" w:eastAsia="Microsoft YaHei"/>
+          <w:color w:val="1C1F26"/>
+          <w:sz w:val="23"/>
+        </w:rPr>
+        <w:t>系统在实现上由十四个 C# 脚本组成，分为攀爬与平衡核心、规则与路径、界面与工具三部分。数据流大致是：手柄的握力输入触发抓握，脚法模块自动把虚拟脚吸附到下方的握点，这些接触点共同决定身体是否留在墙上；平衡模块据此判定是否失稳，失稳到一定程度就触发脱落，进入坠落与重置流程；状态、计时这些信息再驱动界面显示。</w:t>
+      </w:r>
+    </w:p>
+    <w:p>
+      <w:pPr>
+        <w:spacing w:after="160" w:line="348" w:lineRule="auto"/>
+        <w:ind w:left="173"/>
+      </w:pPr>
+      <w:r>
+        <w:rPr>
+          <w:rFonts w:ascii="Microsoft YaHei" w:hAnsi="Microsoft YaHei" w:eastAsia="Microsoft YaHei"/>
+          <w:color w:val="1C1F26"/>
+          <w:sz w:val="23"/>
+        </w:rPr>
+        <w:t>核心算法是平衡判定，我重点讲。我们把二维的支撑面，简化成墙面横轴上的一维区间。具体分四步：第一步，取当前所有接触点——也就是抓握的手和踩住的脚——在横轴上的投影，构成一个区间，记作 low 到 high。第二步，计算重心的横向坐标到这个区间的有符号余量 s，落在区间内为正、落在区间外为负，取值在正负一之间。第三步，当失稳持续超过一个缓冲时间后，平衡量按 s 的大小衰减；一旦重心回到区间内，平衡量就回升。第四步，平衡量降到零就触发脱落。</w:t>
+      </w:r>
+    </w:p>
+    <w:p>
+      <w:pPr>
+        <w:spacing w:after="160" w:line="348" w:lineRule="auto"/>
+        <w:ind w:left="173"/>
+      </w:pPr>
+      <w:r>
+        <w:rPr>
+          <w:rFonts w:ascii="Microsoft YaHei" w:hAnsi="Microsoft YaHei" w:eastAsia="Microsoft YaHei"/>
+          <w:color w:val="1C1F26"/>
+          <w:sz w:val="23"/>
+        </w:rPr>
+        <w:t>这里也就解释了脚法为什么有用：当你踩上一只脚，就给区间增加了一个新的接触点，区间被撑宽，原本偏在外面的重心，就重新落回了支撑范围内，平衡量随之回升。脚法是怎么具体建模的、参数怎么定，请陶锐继续。</w:t>
+      </w:r>
+    </w:p>
+    <w:p>
+      <w:pPr>
+        <w:spacing w:after="160" w:line="336" w:lineRule="auto"/>
+      </w:pPr>
+      <w:r>
+        <w:rPr>
+          <w:rFonts w:ascii="Microsoft YaHei" w:hAnsi="Microsoft YaHei" w:eastAsia="Microsoft YaHei"/>
+          <w:b/>
+          <w:color w:val="C8102E"/>
+          <w:sz w:val="20"/>
+        </w:rPr>
+        <w:t>【提示】</w:t>
+      </w:r>
+      <w:r>
+        <w:rPr>
+          <w:rFonts w:ascii="Microsoft YaHei" w:hAnsi="Microsoft YaHei" w:eastAsia="Microsoft YaHei"/>
+          <w:b w:val="0"/>
+          <w:color w:val="6B7280"/>
+          <w:sz w:val="20"/>
+        </w:rPr>
+        <w:t>「重新落回支撑范围内」这句是全场逻辑闭环，说完停半拍再过渡。</w:t>
       </w:r>
     </w:p>
     <w:p>
@@ -1030,7 +937,7 @@
           <w:color w:val="9E0B22"/>
           <w:sz w:val="32"/>
         </w:rPr>
-        <w:t>P2 吴一轩（玩法规则）</w:t>
+        <w:t>P3 陶锐 · 脚法建模与运行演示</w:t>
       </w:r>
     </w:p>
     <w:p>
@@ -1053,7 +960,7 @@
           <w:color w:val="1C1F26"/>
           <w:sz w:val="20"/>
         </w:rPr>
-        <w:t>脚法抽象与关键常量 / 线路库</w:t>
+        <w:t>脚法建模 / 关键参数 / 运行演示 / 攀爬路径设计</w:t>
       </w:r>
       <w:r>
         <w:rPr>
@@ -1062,7 +969,7 @@
           <w:color w:val="6B7280"/>
           <w:sz w:val="20"/>
         </w:rPr>
-        <w:t xml:space="preserve">　｜　时长：</w:t>
+        <w:t xml:space="preserve">　｜　建议时长：</w:t>
       </w:r>
       <w:r>
         <w:rPr>
@@ -1071,7 +978,7 @@
           <w:color w:val="1C1F26"/>
           <w:sz w:val="20"/>
         </w:rPr>
-        <w:t>约 2 分钟</w:t>
+        <w:t>约 2.5 分钟</w:t>
       </w:r>
     </w:p>
     <w:p>
@@ -1094,7 +1001,7 @@
           <w:color w:val="6B7280"/>
           <w:sz w:val="20"/>
         </w:rPr>
-        <w:t>线路页有视频缩略图，指着讲。重点把「颜色只是建议」和 The Gap 的梗讲出来，可以轻松点。</w:t>
+        <w:t>「运行演示」与「攀爬路径设计」两页含视频，由本人控制播放，旁白卡着画面。</w:t>
       </w:r>
     </w:p>
     <w:p>
@@ -1108,7 +1015,7 @@
           <w:color w:val="1C1F26"/>
           <w:sz w:val="23"/>
         </w:rPr>
-        <w:t>谢谢俊智。我接着把脚和线路讲细一点。刚才说脚是「看不见」的，那它怎么知道该踩哪？其实很像真人爬岩：你踩稳一只脚，是不会随便挪的，非得等爬高了、这只脚实在别扭了，才会换到下一个点。我们就照这个来——脚一旦踩上某个点，就「黏」在那儿，直到你爬过去够不着了，它才松开去找下一个。这样平衡才稳，不会一直跳来跳去。</w:t>
+        <w:t>谢谢一轩。我来讲脚法是怎么建模的，再带大家看实际运行的演示。</w:t>
       </w:r>
     </w:p>
     <w:p>
@@ -1122,7 +1029,7 @@
           <w:color w:val="1C1F26"/>
           <w:sz w:val="23"/>
         </w:rPr>
-        <w:t>可能有人会问，干嘛不老老实实做一双会动的腿？因为在攀岩这种高抬腿、侧身的姿势下，自动算出来的腿十有八九是歪的、穿模的，特别别扭。而我们根本不关心腿长啥样，只关心「这只脚撑不撑得住」——做双假腿纯属费力不讨好。</w:t>
+        <w:t>前面提到，脚被抽象成一个支撑状态，而不是一条腿。具体来说：我们在身体下方估计一个落脚区，左右各选取最近的可踩握点吸附上去；当身体向上移动、原来的脚点够不到了，这只脚就脱离，再吸附到下一个更低的握点——这个机制我们称为 foot-gluing。每一只踩住的脚，都会向平衡判定贡献一个支撑点，从而扩大横向的支撑区间。</w:t>
       </w:r>
     </w:p>
     <w:p>
@@ -1136,7 +1043,7 @@
           <w:color w:val="1C1F26"/>
           <w:sz w:val="23"/>
         </w:rPr>
-        <w:t>还有个细节挺有意思：手是有长度的，大概就一臂展，0.88 米左右。够不着的点你就是抓不到，硬伸也没用，得先把身体挪过去。这一下子就有攀岩那味儿了——不是无脑乱抓，是要规划路线的。</w:t>
+        <w:t>有人可能会问，为什么不直接反解出一条腿？因为在攀爬这种姿势下，逆向运动学或生成式方法很容易失真、穿模，而且这跟我们的机制无关——机制需要的只是「脚有没有提供支撑」这一个信息。至于演示画面里那个会随重力摆动的人形，是用阻尼摆加两段 IK 做出来的视觉表现，它只负责好看，不参与任何交互判定计算。</w:t>
       </w:r>
     </w:p>
     <w:p>
@@ -1150,7 +1057,7 @@
           <w:color w:val="1C1F26"/>
           <w:sz w:val="23"/>
         </w:rPr>
-        <w:t>线路我们做了 5 条，全是程序自动生成的，不用美术也能跑。其中 4 条能爬到顶，难度一条比一条高：热身的 Warm-up；专门逼你用脚保平衡的 Balance Test；放了「易碎点」、逼你别磨蹭的 The Arête；还有考验体力、得省着劲爬的 Endurance。</w:t>
+        <w:t>机制里的几个关键参数，都是按手感设定的经验值，并在编辑器里暴露可调，我们在报告里也如实标注了这一点。比如支撑区间两侧留 0.06 米的容差；平衡量的衰减速率小于回升速率，这样用户一旦把重心扶正就能较快恢复；还有一个真实约束是臂展，大约 0.88 米，超出这个范围的握点就抓不到，必须先移动身体才能够到。</w:t>
       </w:r>
     </w:p>
     <w:p>
@@ -1164,7 +1071,7 @@
           <w:color w:val="1C1F26"/>
           <w:sz w:val="23"/>
         </w:rPr>
-        <w:t>这里要澄清一个点：岩点的颜色——黄的、橙的、紫的——现在只是「建议」，不是硬规定。跟真岩壁一样，你手脚想踩哪个都行。但我们故意把默认线路设计成「纯用手过不去」：你两只手都搬到右边的时候，重心一定会甩出去，这时候你非踩个左脚不可。逼你用脚，懂了吧。</w:t>
+        <w:t>我们看一段实际运行的记录。请注意屏幕上的平衡量指示：当用户把两只手都伸向同一侧时，重心偏出了支撑区间，平衡量开始下降并变红；接着踩上左侧这个橙色脚点，支撑区间被撑宽，重心回到范围内，平衡量恢复、人稳住。这一过程完整体现了我们前面讲的判定逻辑。</w:t>
       </w:r>
     </w:p>
     <w:p>
@@ -1178,30 +1085,7 @@
           <w:color w:val="1C1F26"/>
           <w:sz w:val="23"/>
         </w:rPr>
-        <w:t>最后第 5 条线路最皮，叫 The Gap，是我们故意做成「爬不上去」的——中间空了 2 米，你怎么伸都够不着。它存在的唯一意义，就是向大家证明：我们这个「手够不够得着」是真的有用的，不是摆设。好，下面请邹沛霖带大家看实际效果。</w:t>
-      </w:r>
-    </w:p>
-    <w:p>
-      <w:pPr>
-        <w:spacing w:after="160" w:line="336" w:lineRule="auto"/>
-      </w:pPr>
-      <w:r>
-        <w:rPr>
-          <w:rFonts w:ascii="Microsoft YaHei" w:hAnsi="Microsoft YaHei" w:eastAsia="Microsoft YaHei"/>
-          <w:b/>
-          <w:color w:val="C8102E"/>
-          <w:sz w:val="20"/>
-        </w:rPr>
-        <w:t>【提示】</w:t>
-      </w:r>
-      <w:r>
-        <w:rPr>
-          <w:rFonts w:ascii="Microsoft YaHei" w:hAnsi="Microsoft YaHei" w:eastAsia="Microsoft YaHei"/>
-          <w:b w:val="0"/>
-          <w:color w:val="6B7280"/>
-          <w:sz w:val="20"/>
-        </w:rPr>
-        <w:t>说到「看实际效果」把场子交给 P3，由他控制视频播放。</w:t>
+        <w:t>攀爬路径方面，我们用程序化方式生成了五条：四条可以完成，难度依次递增——基础路径、强制使用脚的同侧连续路径、含易碎握点需要快速通过的路径、以及考验体力管理的路径；另外还有一条对照路径故意不可完成，中段留出约两米的空白，手臂伸直也够不到，用来验证臂展约束确实生效，而不是装饰性设定。下面请邹沛霖介绍我们的验证与评测。</w:t>
       </w:r>
     </w:p>
     <w:p>
@@ -1229,7 +1113,7 @@
           <w:color w:val="9E0B22"/>
           <w:sz w:val="32"/>
         </w:rPr>
-        <w:t>P3 邹沛霖（场景美术 · Demo）</w:t>
+        <w:t>P4 邹沛霖 · 验证、评测与总结</w:t>
       </w:r>
     </w:p>
     <w:p>
@@ -1252,7 +1136,7 @@
           <w:color w:val="1C1F26"/>
           <w:sz w:val="20"/>
         </w:rPr>
-        <w:t>Demo 核心高光 / 化身演进</w:t>
+        <w:t>开发与验证方法 / 评测方案 / 总结与展望</w:t>
       </w:r>
       <w:r>
         <w:rPr>
@@ -1261,7 +1145,7 @@
           <w:color w:val="6B7280"/>
           <w:sz w:val="20"/>
         </w:rPr>
-        <w:t xml:space="preserve">　｜　时长：</w:t>
+        <w:t xml:space="preserve">　｜　建议时长：</w:t>
       </w:r>
       <w:r>
         <w:rPr>
@@ -1270,7 +1154,7 @@
           <w:color w:val="1C1F26"/>
           <w:sz w:val="20"/>
         </w:rPr>
-        <w:t>约 1.5 分钟</w:t>
+        <w:t>约 2.5 分钟</w:t>
       </w:r>
     </w:p>
     <w:p>
@@ -1293,7 +1177,7 @@
           <w:color w:val="6B7280"/>
           <w:sz w:val="20"/>
         </w:rPr>
-        <w:t>先点开第 8 页 demo 视频，边播边讲，旁白卡着画面。视频约 25 秒，别抢拍。</w:t>
+        <w:t>本部分收尾，语气沉稳。结尾「谢谢」后停住，准备进入提问环节。</w:t>
       </w:r>
     </w:p>
     <w:p>
@@ -1307,7 +1191,7 @@
           <w:color w:val="1C1F26"/>
           <w:sz w:val="23"/>
         </w:rPr>
-        <w:t>好，咱们直接看。大家盯着屏幕上这根平衡条——看，现在这个小人两只手都伸到右边去了，平衡条开始变红、闪起来了，这就是在告诉你：重心歪出去了，要掉了！</w:t>
+        <w:t>谢谢陶锐。最后由我介绍我们是如何验证这套系统的、评测方案怎么设计，以及整体结论。</w:t>
       </w:r>
     </w:p>
     <w:p>
@@ -1321,7 +1205,7 @@
           <w:color w:val="1C1F26"/>
           <w:sz w:val="23"/>
         </w:rPr>
-        <w:t>注意看这一下——他踩上了左边这个橙色的脚点，平衡条「唰」地就回来了，人稳住了。就这一下，「变红、踩脚、回正」，是现在市面上所有 VR 攀岩都做不到的。这就是我们的招牌动作。</w:t>
+        <w:t>我们采取的是「以自动化验证驱动开发」的方法。在调手感、做画面之前，我们先写了一个脚本化的虚拟受试者，让它像真实用户一样去抓握、移动、制造失稳，然后自动检查完整的交互流程：失稳会不会脱落、脱落会不会重置、到顶会不会计时等等，一共十项断言，全部通过；再加上对平衡与位移核心数学的九项单元测试，也全部通过。</w:t>
       </w:r>
     </w:p>
     <w:p>
@@ -1335,7 +1219,49 @@
           <w:color w:val="1C1F26"/>
           <w:sz w:val="23"/>
         </w:rPr>
-        <w:t>旁边这几个颜色是图例：黄的是手点、橙的是脚点、绿的是终点。要是真掉下去了，会重生回到检查点，爬到顶的时候，上面会蹦出「Summit」和你的通关时间。</w:t>
+        <w:t>这样做有一个实际好处：机制的正确性由自动化保证，因此我们五名成员可以并行开发，不必排队共用同一台头显设备，每次改动都会自动回归验证，避免破坏已经稳定的部分。我们还提供了第三人称和第一人称两个场景，用键盘鼠标就能直接操作验证。</w:t>
+      </w:r>
+    </w:p>
+    <w:p>
+      <w:pPr>
+        <w:spacing w:after="160" w:line="348" w:lineRule="auto"/>
+        <w:ind w:left="173"/>
+      </w:pPr>
+      <w:r>
+        <w:rPr>
+          <w:rFonts w:ascii="Microsoft YaHei" w:hAnsi="Microsoft YaHei" w:eastAsia="Microsoft YaHei"/>
+          <w:color w:val="1C1F26"/>
+          <w:sz w:val="23"/>
+        </w:rPr>
+        <w:t>评测方案我们已经设计完成，待开展真人实验。设计是被试内对比：条件 A 只有手部，条件 B 加入平衡与脚法，两组使用相同路径并平衡顺序。客观指标包括到顶用时、按成因分类的脱落次数、以及平衡余量随时间的变化曲线；主观量表采用 NASA-TLX 任务负荷、SSQ 模拟器晕动，以及真实感与偏好量表。我们的研究假设是：相比 A，B 的真实感与挑战度更高，而模拟器晕动没有显著上升——因为它增加的是决策判断的难度，而不是画面运动带来的不适。</w:t>
+      </w:r>
+    </w:p>
+    <w:p>
+      <w:pPr>
+        <w:spacing w:after="160" w:line="348" w:lineRule="auto"/>
+        <w:ind w:left="173"/>
+      </w:pPr>
+      <w:r>
+        <w:rPr>
+          <w:rFonts w:ascii="Microsoft YaHei" w:hAnsi="Microsoft YaHei" w:eastAsia="Microsoft YaHei"/>
+          <w:color w:val="1C1F26"/>
+          <w:sz w:val="23"/>
+        </w:rPr>
+        <w:t>做个总结。我们提出并实现了一种在三点追踪条件下的平衡与脚法建模方法：以头显近似重心、以横向支撑区间判定失稳，以自动吸附的虚拟脚提供支撑，使脚法能够影响成败；系统已完整实现，并通过了自动化的端到端验证。未来工作是开展受试者评测，并向二维支撑判定、受试者自主选点、以及真机部署方向扩展。</w:t>
+      </w:r>
+    </w:p>
+    <w:p>
+      <w:pPr>
+        <w:spacing w:after="160" w:line="348" w:lineRule="auto"/>
+        <w:ind w:left="173"/>
+      </w:pPr>
+      <w:r>
+        <w:rPr>
+          <w:rFonts w:ascii="Microsoft YaHei" w:hAnsi="Microsoft YaHei" w:eastAsia="Microsoft YaHei"/>
+          <w:color w:val="1C1F26"/>
+          <w:sz w:val="23"/>
+        </w:rPr>
+        <w:t>以上就是我们小组的全部汇报。谢谢各位，欢迎提问。</w:t>
       </w:r>
     </w:p>
     <w:p>
@@ -1358,248 +1284,7 @@
           <w:color w:val="6B7280"/>
           <w:sz w:val="20"/>
         </w:rPr>
-        <w:t>切第 9 页线路视频，快速扫四条完攀 + The Gap，再切第 11 页化身演进对比图。</w:t>
-      </w:r>
-    </w:p>
-    <w:p>
-      <w:pPr>
-        <w:spacing w:after="160" w:line="348" w:lineRule="auto"/>
-        <w:ind w:left="173"/>
-      </w:pPr>
-      <w:r>
-        <w:rPr>
-          <w:rFonts w:ascii="Microsoft YaHei" w:hAnsi="Microsoft YaHei" w:eastAsia="Microsoft YaHei"/>
-          <w:color w:val="1C1F26"/>
-          <w:sz w:val="23"/>
-        </w:rPr>
-        <w:t>这几段是四条线路从头爬到顶的完整录像，最后这条够不着的，就是刚才一轩说的 The Gap。</w:t>
-      </w:r>
-    </w:p>
-    <w:p>
-      <w:pPr>
-        <w:spacing w:after="160" w:line="348" w:lineRule="auto"/>
-        <w:ind w:left="173"/>
-      </w:pPr>
-      <w:r>
-        <w:rPr>
-          <w:rFonts w:ascii="Microsoft YaHei" w:hAnsi="Microsoft YaHei" w:eastAsia="Microsoft YaHei"/>
-          <w:color w:val="1C1F26"/>
-          <w:sz w:val="23"/>
-        </w:rPr>
-        <w:t>再说说画面。我们的小人一开始特别丑，是个直挺挺的假人，跟提线木偶似的。后来我们找了一款做得很好的物理攀岩游戏当参照，一帧一帧对着改，改成了现在这样——整个身子是「挂」在抓着的那只手上的，单手吊着时身体会自然倒向那只手，脑袋还一直冲着岩壁看，一下就像真人在爬了。这些纯为好看，不影响里面的玩法逻辑。</w:t>
-      </w:r>
-    </w:p>
-    <w:p>
-      <w:pPr>
-        <w:spacing w:after="160" w:line="348" w:lineRule="auto"/>
-        <w:ind w:left="173"/>
-      </w:pPr>
-      <w:r>
-        <w:rPr>
-          <w:rFonts w:ascii="Microsoft YaHei" w:hAnsi="Microsoft YaHei" w:eastAsia="Microsoft YaHei"/>
-          <w:color w:val="1C1F26"/>
-          <w:sz w:val="23"/>
-        </w:rPr>
-        <w:t>接下来请陶锐，给大家讲讲我们整个项目是怎么一步步做出来的，最后交付了些什么。</w:t>
-      </w:r>
-    </w:p>
-    <w:p>
-      <w:pPr>
-        <w:spacing w:after="40" w:before="0" w:line="336" w:lineRule="auto"/>
-      </w:pPr>
-    </w:p>
-    <w:p>
-      <w:pPr>
-        <w:spacing w:after="40" w:line="336" w:lineRule="auto"/>
-      </w:pPr>
-      <w:r>
-        <w:rPr>
-          <w:rFonts w:ascii="Microsoft YaHei" w:hAnsi="Microsoft YaHei" w:eastAsia="Microsoft YaHei"/>
-          <w:b/>
-          <w:color w:val="C8102E"/>
-          <w:sz w:val="32"/>
-        </w:rPr>
-        <w:t xml:space="preserve">第 五 部分　</w:t>
-      </w:r>
-      <w:r>
-        <w:rPr>
-          <w:rFonts w:ascii="Microsoft YaHei" w:hAnsi="Microsoft YaHei" w:eastAsia="Microsoft YaHei"/>
-          <w:b/>
-          <w:color w:val="9E0B22"/>
-          <w:sz w:val="32"/>
-        </w:rPr>
-        <w:t>P4 陶锐（XR / 工程 · 收尾）</w:t>
-      </w:r>
-    </w:p>
-    <w:p>
-      <w:pPr>
-        <w:spacing w:after="80" w:line="336" w:lineRule="auto"/>
-      </w:pPr>
-      <w:r>
-        <w:rPr>
-          <w:rFonts w:ascii="Microsoft YaHei" w:hAnsi="Microsoft YaHei" w:eastAsia="Microsoft YaHei"/>
-          <w:b w:val="0"/>
-          <w:color w:val="6B7280"/>
-          <w:sz w:val="20"/>
-        </w:rPr>
-        <w:t>对应幻灯片：</w:t>
-      </w:r>
-      <w:r>
-        <w:rPr>
-          <w:rFonts w:ascii="Microsoft YaHei" w:hAnsi="Microsoft YaHei" w:eastAsia="Microsoft YaHei"/>
-          <w:b/>
-          <w:color w:val="1C1F26"/>
-          <w:sz w:val="20"/>
-        </w:rPr>
-        <w:t>整体任务思路 / 评测体系 / 项目总结</w:t>
-      </w:r>
-      <w:r>
-        <w:rPr>
-          <w:rFonts w:ascii="Microsoft YaHei" w:hAnsi="Microsoft YaHei" w:eastAsia="Microsoft YaHei"/>
-          <w:b w:val="0"/>
-          <w:color w:val="6B7280"/>
-          <w:sz w:val="20"/>
-        </w:rPr>
-        <w:t xml:space="preserve">　｜　时长：</w:t>
-      </w:r>
-      <w:r>
-        <w:rPr>
-          <w:rFonts w:ascii="Microsoft YaHei" w:hAnsi="Microsoft YaHei" w:eastAsia="Microsoft YaHei"/>
-          <w:b/>
-          <w:color w:val="1C1F26"/>
-          <w:sz w:val="20"/>
-        </w:rPr>
-        <w:t>约 2 分钟</w:t>
-      </w:r>
-    </w:p>
-    <w:p>
-      <w:pPr>
-        <w:spacing w:after="160" w:line="336" w:lineRule="auto"/>
-      </w:pPr>
-      <w:r>
-        <w:rPr>
-          <w:rFonts w:ascii="Microsoft YaHei" w:hAnsi="Microsoft YaHei" w:eastAsia="Microsoft YaHei"/>
-          <w:b/>
-          <w:color w:val="C8102E"/>
-          <w:sz w:val="20"/>
-        </w:rPr>
-        <w:t>【提示】</w:t>
-      </w:r>
-      <w:r>
-        <w:rPr>
-          <w:rFonts w:ascii="Microsoft YaHei" w:hAnsi="Microsoft YaHei" w:eastAsia="Microsoft YaHei"/>
-          <w:b w:val="0"/>
-          <w:color w:val="6B7280"/>
-          <w:sz w:val="20"/>
-        </w:rPr>
-        <w:t>这是收尾，语气要稳、要收得住。结尾「谢谢」后停住，准备接 Q&amp;A。</w:t>
-      </w:r>
-    </w:p>
-    <w:p>
-      <w:pPr>
-        <w:spacing w:after="160" w:line="348" w:lineRule="auto"/>
-        <w:ind w:left="173"/>
-      </w:pPr>
-      <w:r>
-        <w:rPr>
-          <w:rFonts w:ascii="Microsoft YaHei" w:hAnsi="Microsoft YaHei" w:eastAsia="Microsoft YaHei"/>
-          <w:color w:val="1C1F26"/>
-          <w:sz w:val="23"/>
-        </w:rPr>
-        <w:t>谢谢沛霖。我来说说我们这个项目整体是怎么推进的，以及最后到底做出了什么。</w:t>
-      </w:r>
-    </w:p>
-    <w:p>
-      <w:pPr>
-        <w:spacing w:after="160" w:line="348" w:lineRule="auto"/>
-        <w:ind w:left="173"/>
-      </w:pPr>
-      <w:r>
-        <w:rPr>
-          <w:rFonts w:ascii="Microsoft YaHei" w:hAnsi="Microsoft YaHei" w:eastAsia="Microsoft YaHei"/>
-          <w:color w:val="1C1F26"/>
-          <w:sz w:val="23"/>
-        </w:rPr>
-        <w:t>我们有个原则，叫「先保证能验证，再谈别的」。我们没一上来就埋头调手感、做美术，而是先写了个「机器人」——让程序自己当玩家，自动地抓、爬、故意失衡，然后检查：失衡会不会掉？掉了会不会重生？到顶会不会计时？我们定了 10 条这样的检查，再加 9 条平衡算法的数学验证，全部一次通过。</w:t>
-      </w:r>
-    </w:p>
-    <w:p>
-      <w:pPr>
-        <w:spacing w:after="160" w:line="348" w:lineRule="auto"/>
-        <w:ind w:left="173"/>
-      </w:pPr>
-      <w:r>
-        <w:rPr>
-          <w:rFonts w:ascii="Microsoft YaHei" w:hAnsi="Microsoft YaHei" w:eastAsia="Microsoft YaHei"/>
-          <w:color w:val="1C1F26"/>
-          <w:sz w:val="23"/>
-        </w:rPr>
-        <w:t>这么做有个特别实在的好处：核心玩法对不对，机器自动帮我们盯着。所以我们五个人能各干各的、同时往前推，不用排队抢那一个头显。而且每次有人改了代码，机器人立马重跑，保证没把原来好好的东西改坏。</w:t>
-      </w:r>
-    </w:p>
-    <w:p>
-      <w:pPr>
-        <w:spacing w:after="160" w:line="348" w:lineRule="auto"/>
-        <w:ind w:left="173"/>
-      </w:pPr>
-      <w:r>
-        <w:rPr>
-          <w:rFonts w:ascii="Microsoft YaHei" w:hAnsi="Microsoft YaHei" w:eastAsia="Microsoft YaHei"/>
-          <w:color w:val="1C1F26"/>
-          <w:sz w:val="23"/>
-        </w:rPr>
-        <w:t>再说评测。我们把「怎么测」这件事先备齐了：让 5 到 8 个同学分别玩「纯手版」和「平衡加脚法版」，记录他们的通关时间、摔了几次、分别是因为啥摔的，再用两份业界标准问卷量一下「累不累」和「晕不晕」。这套采集的工具和流程我们都做好了。我们赌的是：加了平衡和脚法之后，玩家会觉得更真实、更有挑战，但不会更晕——因为难度是动脑子的难度，不是那种让人反胃的晃动。</w:t>
-      </w:r>
-    </w:p>
-    <w:p>
-      <w:pPr>
-        <w:spacing w:after="160" w:line="348" w:lineRule="auto"/>
-        <w:ind w:left="173"/>
-      </w:pPr>
-      <w:r>
-        <w:rPr>
-          <w:rFonts w:ascii="Microsoft YaHei" w:hAnsi="Microsoft YaHei" w:eastAsia="Microsoft YaHei"/>
-          <w:color w:val="1C1F26"/>
-          <w:sz w:val="23"/>
-        </w:rPr>
-        <w:t>最后总结一下我们交付了啥：平衡机制、脚法、5 条线路、那套自动检查、屏幕上的血条和音效、能上手玩的两个视角、演示视频、还有报告和答辩材料——全都做完了。唯一还没做的，就是真的把那 5 到 8 个同学拉来做实验。</w:t>
-      </w:r>
-    </w:p>
-    <w:p>
-      <w:pPr>
-        <w:spacing w:after="160" w:line="348" w:lineRule="auto"/>
-        <w:ind w:left="173"/>
-      </w:pPr>
-      <w:r>
-        <w:rPr>
-          <w:rFonts w:ascii="Microsoft YaHei" w:hAnsi="Microsoft YaHei" w:eastAsia="Microsoft YaHei"/>
-          <w:color w:val="1C1F26"/>
-          <w:sz w:val="23"/>
-        </w:rPr>
-        <w:t>一句话收尾：Summit VR 证明了一件事——脚法和平衡，真的可以用很低的成本、很稳妥地加进只有手柄的 VR 攀岩里。谢谢大家，欢迎提问。</w:t>
-      </w:r>
-    </w:p>
-    <w:p>
-      <w:pPr>
-        <w:spacing w:after="160" w:line="336" w:lineRule="auto"/>
-      </w:pPr>
-      <w:r>
-        <w:rPr>
-          <w:rFonts w:ascii="Microsoft YaHei" w:hAnsi="Microsoft YaHei" w:eastAsia="Microsoft YaHei"/>
-          <w:b/>
-          <w:color w:val="C8102E"/>
-          <w:sz w:val="20"/>
-        </w:rPr>
-        <w:t>【提示】</w:t>
-      </w:r>
-      <w:r>
-        <w:rPr>
-          <w:rFonts w:ascii="Microsoft YaHei" w:hAnsi="Microsoft YaHei" w:eastAsia="Microsoft YaHei"/>
-          <w:b w:val="0"/>
-          <w:color w:val="6B7280"/>
-          <w:sz w:val="20"/>
-        </w:rPr>
-        <w:t>「谢谢大家」后五人一起致意。Q&amp;A 细节见 docs/DEFENSE_QA.md，对应模块的问题由对应负责人接。</w:t>
+        <w:t>「谢谢各位」后四人一同致意。各模块的提问由对应负责人回答，细节参见 docs/DEFENSE_QA.md。</w:t>
       </w:r>
     </w:p>
     <w:sectPr>

</xml_diff>